<commit_message>
Move project logs to private workspace
</commit_message>
<xml_diff>
--- a/docs/methodology/DOCUMENTO INTEGRADO v0.1.docx
+++ b/docs/methodology/DOCUMENTO INTEGRADO v0.1.docx
@@ -3,96 +3,46 @@
 <w:document xmlns:wpc="http://schemas.microsoft.com/office/word/2010/wordprocessingCanvas" xmlns:cx="http://schemas.microsoft.com/office/drawing/2014/chartex" xmlns:cx1="http://schemas.microsoft.com/office/drawing/2015/9/8/chartex" xmlns:cx2="http://schemas.microsoft.com/office/drawing/2015/10/21/chartex" xmlns:cx3="http://schemas.microsoft.com/office/drawing/2016/5/9/chartex" xmlns:cx4="http://schemas.microsoft.com/office/drawing/2016/5/10/chartex" xmlns:cx5="http://schemas.microsoft.com/office/drawing/2016/5/11/chartex" xmlns:cx6="http://schemas.microsoft.com/office/drawing/2016/5/12/chartex" xmlns:cx7="http://schemas.microsoft.com/office/drawing/2016/5/13/chartex" xmlns:cx8="http://schemas.microsoft.com/office/drawing/2016/5/14/chartex" xmlns:mc="http://schemas.openxmlformats.org/markup-compatibility/2006" xmlns:aink="http://schemas.microsoft.com/office/drawing/2016/ink" xmlns:am3d="http://schemas.microsoft.com/office/drawing/2017/model3d" xmlns:o="urn:schemas-microsoft-com:office:office" xmlns:oel="http://schemas.microsoft.com/office/2019/extlst" xmlns:r="http://schemas.openxmlformats.org/officeDocument/2006/relationships" xmlns:m="http://schemas.openxmlformats.org/officeDocument/2006/math" xmlns:v="urn:schemas-microsoft-com:vml" xmlns:wp14="http://schemas.microsoft.com/office/word/2010/wordprocessingDrawing" xmlns:wp="http://schemas.openxmlformats.org/drawingml/2006/wordprocessingDrawing" xmlns:w10="urn:schemas-microsoft-com:office:word" xmlns:w="http://schemas.openxmlformats.org/wordprocessingml/2006/main" xmlns:w14="http://schemas.microsoft.com/office/word/2010/wordml" xmlns:w15="http://schemas.microsoft.com/office/word/2012/wordml" xmlns:w16cex="http://schemas.microsoft.com/office/word/2018/wordml/cex" xmlns:w16cid="http://schemas.microsoft.com/office/word/2016/wordml/cid" xmlns:w16="http://schemas.microsoft.com/office/word/2018/wordml" xmlns:w16du="http://schemas.microsoft.com/office/word/2023/wordml/word16du" xmlns:w16sdtdh="http://schemas.microsoft.com/office/word/2020/wordml/sdtdatahash" xmlns:w16sdtfl="http://schemas.microsoft.com/office/word/2024/wordml/sdtformatlock" xmlns:w16se="http://schemas.microsoft.com/office/word/2015/wordml/symex" xmlns:wpg="http://schemas.microsoft.com/office/word/2010/wordprocessingGroup" xmlns:wpi="http://schemas.microsoft.com/office/word/2010/wordprocessingInk" xmlns:wne="http://schemas.microsoft.com/office/word/2006/wordml" xmlns:wps="http://schemas.microsoft.com/office/word/2010/wordprocessingShape" mc:Ignorable="w14 w15 w16se w16cid w16 w16cex w16sdtdh w16sdtfl w16du wp14">
   <w:body>
     <w:p>
-      <w:pPr>
-        <w:rPr>
-          <w:rFonts w:ascii="Times New Roman" w:hAnsi="Times New Roman" w:cs="Times New Roman"/>
-        </w:rPr>
-      </w:pPr>
-      <w:r>
-        <w:rPr>
-          <w:rFonts w:ascii="Times New Roman" w:hAnsi="Times New Roman" w:cs="Times New Roman"/>
-        </w:rPr>
+      <w:r>
         <w:t>DOCUMENTO INTEGRADO v0.1</w:t>
       </w:r>
     </w:p>
     <w:p>
-      <w:pPr>
-        <w:rPr>
-          <w:rFonts w:ascii="Times New Roman" w:hAnsi="Times New Roman" w:cs="Times New Roman"/>
-        </w:rPr>
-      </w:pPr>
-      <w:r>
-        <w:rPr>
-          <w:rFonts w:ascii="Times New Roman" w:hAnsi="Times New Roman" w:cs="Times New Roman"/>
-        </w:rPr>
+      <w:r>
         <w:t>CONTINUUM AI ANALYTICS</w:t>
       </w:r>
       <w:r>
-        <w:rPr>
-          <w:rFonts w:ascii="Times New Roman" w:hAnsi="Times New Roman" w:cs="Times New Roman"/>
-        </w:rPr>
         <w:br/>
         <w:t>Unidad tecnológica: CSI Labs</w:t>
       </w:r>
     </w:p>
     <w:p>
-      <w:pPr>
-        <w:rPr>
-          <w:rFonts w:ascii="Times New Roman" w:hAnsi="Times New Roman" w:cs="Times New Roman"/>
-        </w:rPr>
-      </w:pPr>
-      <w:r>
-        <w:rPr>
-          <w:rFonts w:ascii="Times New Roman" w:hAnsi="Times New Roman" w:cs="Times New Roman"/>
-        </w:rPr>
+      <w:r>
         <w:t>Título provisional:</w:t>
       </w:r>
       <w:r>
-        <w:rPr>
-          <w:rFonts w:ascii="Times New Roman" w:hAnsi="Times New Roman" w:cs="Times New Roman"/>
-        </w:rPr>
         <w:br/>
         <w:t xml:space="preserve">"Continuum </w:t>
       </w:r>
       <w:proofErr w:type="spellStart"/>
       <w:r>
-        <w:rPr>
-          <w:rFonts w:ascii="Times New Roman" w:hAnsi="Times New Roman" w:cs="Times New Roman"/>
-        </w:rPr>
         <w:t>Semantic</w:t>
       </w:r>
       <w:proofErr w:type="spellEnd"/>
       <w:r>
-        <w:rPr>
-          <w:rFonts w:ascii="Times New Roman" w:hAnsi="Times New Roman" w:cs="Times New Roman"/>
-        </w:rPr>
         <w:t xml:space="preserve"> </w:t>
       </w:r>
       <w:proofErr w:type="spellStart"/>
       <w:r>
-        <w:rPr>
-          <w:rFonts w:ascii="Times New Roman" w:hAnsi="Times New Roman" w:cs="Times New Roman"/>
-        </w:rPr>
         <w:t>Index</w:t>
       </w:r>
       <w:proofErr w:type="spellEnd"/>
       <w:r>
-        <w:rPr>
-          <w:rFonts w:ascii="Times New Roman" w:hAnsi="Times New Roman" w:cs="Times New Roman"/>
-        </w:rPr>
         <w:t xml:space="preserve"> (CSI): Sistema para la Auditoría de Convergencia Semántica y Colapso de Distinción en Inteligencia Artificial"</w:t>
       </w:r>
     </w:p>
     <w:p>
-      <w:pPr>
-        <w:rPr>
-          <w:rFonts w:ascii="Times New Roman" w:hAnsi="Times New Roman" w:cs="Times New Roman"/>
-        </w:rPr>
-      </w:pPr>
-      <w:r>
-        <w:rPr>
-          <w:rFonts w:ascii="Times New Roman" w:hAnsi="Times New Roman" w:cs="Times New Roman"/>
-        </w:rPr>
+      <w:r>
         <w:t>======================================================================</w:t>
       </w:r>
     </w:p>
@@ -102,130 +52,71 @@
           <w:ilvl w:val="0"/>
           <w:numId w:val="1"/>
         </w:numPr>
-        <w:rPr>
-          <w:rFonts w:ascii="Times New Roman" w:hAnsi="Times New Roman" w:cs="Times New Roman"/>
-        </w:rPr>
-      </w:pPr>
-      <w:r>
-        <w:rPr>
-          <w:rFonts w:ascii="Times New Roman" w:hAnsi="Times New Roman" w:cs="Times New Roman"/>
-        </w:rPr>
+      </w:pPr>
+      <w:r>
         <w:t>RESUMEN EJECUTIVO</w:t>
       </w:r>
       <w:r>
-        <w:rPr>
-          <w:rFonts w:ascii="Times New Roman" w:hAnsi="Times New Roman" w:cs="Times New Roman"/>
-        </w:rPr>
         <w:br/>
         <w:t>======================================================================</w:t>
       </w:r>
     </w:p>
     <w:p>
+      <w:r>
+        <w:t xml:space="preserve">Continuum AI </w:t>
+      </w:r>
+      <w:proofErr w:type="spellStart"/>
+      <w:r>
+        <w:t>Analytics</w:t>
+      </w:r>
+      <w:proofErr w:type="spellEnd"/>
+      <w:r>
+        <w:t xml:space="preserve"> es una iniciativa orientada al desarrollo de metodologías, métricas y herramientas destinadas a detectar, cuantificar y monitorizar fenómenos de convergencia semántica, homogeneización representacional y colapso de distinción en sistemas avanzados de inteligencia artificial.</w:t>
+      </w:r>
+    </w:p>
+    <w:p>
+      <w:r>
+        <w:t xml:space="preserve">El activo principal del proyecto es el Continuum </w:t>
+      </w:r>
+      <w:proofErr w:type="spellStart"/>
+      <w:r>
+        <w:t>Semantic</w:t>
+      </w:r>
+      <w:proofErr w:type="spellEnd"/>
+      <w:r>
+        <w:t xml:space="preserve"> </w:t>
+      </w:r>
+      <w:proofErr w:type="spellStart"/>
+      <w:r>
+        <w:t>Index</w:t>
+      </w:r>
+      <w:proofErr w:type="spellEnd"/>
+      <w:r>
+        <w:t xml:space="preserve"> (CSI), una metodología destinada a medir la pérdida de diversidad semántica y pluralidad representacional en modelos de IA.</w:t>
+      </w:r>
+    </w:p>
+    <w:p>
+      <w:r>
+        <w:t xml:space="preserve">La iniciativa aspira a evolucionar desde un marco conceptual y metodológico hacia una futura empresa de base tecnológica vinculada a la </w:t>
+      </w:r>
+      <w:proofErr w:type="spellStart"/>
+      <w:r>
+        <w:t>Universidade</w:t>
+      </w:r>
+      <w:proofErr w:type="spellEnd"/>
+      <w:r>
+        <w:t xml:space="preserve"> de Vigo, especializada en auditoría, gobernanza y evaluación de riesgos emergentes en sistemas de IA.</w:t>
+      </w:r>
+    </w:p>
+    <w:p>
       <w:pPr>
         <w:rPr>
-          <w:rFonts w:ascii="Times New Roman" w:hAnsi="Times New Roman" w:cs="Times New Roman"/>
-        </w:rPr>
-      </w:pPr>
-      <w:r>
-        <w:rPr>
-          <w:rFonts w:ascii="Times New Roman" w:hAnsi="Times New Roman" w:cs="Times New Roman"/>
-        </w:rPr>
-        <w:t xml:space="preserve">Continuum AI </w:t>
-      </w:r>
-      <w:proofErr w:type="spellStart"/>
-      <w:r>
-        <w:rPr>
-          <w:rFonts w:ascii="Times New Roman" w:hAnsi="Times New Roman" w:cs="Times New Roman"/>
-        </w:rPr>
-        <w:t>Analytics</w:t>
-      </w:r>
-      <w:proofErr w:type="spellEnd"/>
-      <w:r>
-        <w:rPr>
-          <w:rFonts w:ascii="Times New Roman" w:hAnsi="Times New Roman" w:cs="Times New Roman"/>
-        </w:rPr>
-        <w:t xml:space="preserve"> es una iniciativa orientada al desarrollo de metodologías, métricas y herramientas destinadas a detectar, cuantificar y monitorizar fenómenos de convergencia semántica, homogeneización representacional y colapso de distinción en sistemas avanzados de inteligencia artificial.</w:t>
-      </w:r>
-    </w:p>
-    <w:p>
-      <w:pPr>
-        <w:rPr>
-          <w:rFonts w:ascii="Times New Roman" w:hAnsi="Times New Roman" w:cs="Times New Roman"/>
-        </w:rPr>
-      </w:pPr>
-      <w:r>
-        <w:rPr>
-          <w:rFonts w:ascii="Times New Roman" w:hAnsi="Times New Roman" w:cs="Times New Roman"/>
-        </w:rPr>
-        <w:t xml:space="preserve">El activo principal del proyecto es el Continuum </w:t>
-      </w:r>
-      <w:proofErr w:type="spellStart"/>
-      <w:r>
-        <w:rPr>
-          <w:rFonts w:ascii="Times New Roman" w:hAnsi="Times New Roman" w:cs="Times New Roman"/>
-        </w:rPr>
-        <w:t>Semantic</w:t>
-      </w:r>
-      <w:proofErr w:type="spellEnd"/>
-      <w:r>
-        <w:rPr>
-          <w:rFonts w:ascii="Times New Roman" w:hAnsi="Times New Roman" w:cs="Times New Roman"/>
-        </w:rPr>
-        <w:t xml:space="preserve"> </w:t>
-      </w:r>
-      <w:proofErr w:type="spellStart"/>
-      <w:r>
-        <w:rPr>
-          <w:rFonts w:ascii="Times New Roman" w:hAnsi="Times New Roman" w:cs="Times New Roman"/>
-        </w:rPr>
-        <w:t>Index</w:t>
-      </w:r>
-      <w:proofErr w:type="spellEnd"/>
-      <w:r>
-        <w:rPr>
-          <w:rFonts w:ascii="Times New Roman" w:hAnsi="Times New Roman" w:cs="Times New Roman"/>
-        </w:rPr>
-        <w:t xml:space="preserve"> (CSI), una metodología destinada a medir la pérdida de diversidad semántica y pluralidad representacional en modelos de IA.</w:t>
-      </w:r>
-    </w:p>
-    <w:p>
-      <w:pPr>
-        <w:rPr>
-          <w:rFonts w:ascii="Times New Roman" w:hAnsi="Times New Roman" w:cs="Times New Roman"/>
-        </w:rPr>
-      </w:pPr>
-      <w:r>
-        <w:rPr>
-          <w:rFonts w:ascii="Times New Roman" w:hAnsi="Times New Roman" w:cs="Times New Roman"/>
-        </w:rPr>
-        <w:t xml:space="preserve">La iniciativa aspira a evolucionar desde un marco conceptual y metodológico hacia una futura empresa de base tecnológica vinculada a la </w:t>
-      </w:r>
-      <w:proofErr w:type="spellStart"/>
-      <w:r>
-        <w:rPr>
-          <w:rFonts w:ascii="Times New Roman" w:hAnsi="Times New Roman" w:cs="Times New Roman"/>
-        </w:rPr>
-        <w:t>Universidade</w:t>
-      </w:r>
-      <w:proofErr w:type="spellEnd"/>
-      <w:r>
-        <w:rPr>
-          <w:rFonts w:ascii="Times New Roman" w:hAnsi="Times New Roman" w:cs="Times New Roman"/>
-        </w:rPr>
-        <w:t xml:space="preserve"> de Vigo, especializada en auditoría, gobernanza y evaluación de riesgos emergentes en sistemas de IA.</w:t>
-      </w:r>
-    </w:p>
-    <w:p>
-      <w:pPr>
-        <w:rPr>
-          <w:rFonts w:ascii="Times New Roman" w:hAnsi="Times New Roman" w:cs="Times New Roman"/>
           <w:b/>
           <w:bCs/>
         </w:rPr>
       </w:pPr>
       <w:r>
         <w:rPr>
-          <w:rFonts w:ascii="Times New Roman" w:hAnsi="Times New Roman" w:cs="Times New Roman"/>
           <w:b/>
           <w:bCs/>
         </w:rPr>
@@ -233,7 +124,6 @@
       </w:r>
       <w:r>
         <w:rPr>
-          <w:rFonts w:ascii="Times New Roman" w:hAnsi="Times New Roman" w:cs="Times New Roman"/>
           <w:b/>
           <w:bCs/>
         </w:rPr>
@@ -242,185 +132,109 @@
       </w:r>
     </w:p>
     <w:p>
+      <w:r>
+        <w:t>Los modelos de inteligencia artificial actuales son sometidos a múltiples procesos de entrenamiento, ajuste, alineamiento y optimización.</w:t>
+      </w:r>
+    </w:p>
+    <w:p>
+      <w:r>
+        <w:t>Estos procesos pueden generar fenómenos de:</w:t>
+      </w:r>
+    </w:p>
+    <w:p>
+      <w:pPr>
+        <w:numPr>
+          <w:ilvl w:val="0"/>
+          <w:numId w:val="2"/>
+        </w:numPr>
+      </w:pPr>
+      <w:r>
+        <w:t>Homogeneización de respuestas.</w:t>
+      </w:r>
+    </w:p>
+    <w:p>
+      <w:pPr>
+        <w:numPr>
+          <w:ilvl w:val="0"/>
+          <w:numId w:val="2"/>
+        </w:numPr>
+      </w:pPr>
+      <w:r>
+        <w:t>Convergencia de representaciones internas.</w:t>
+      </w:r>
+    </w:p>
+    <w:p>
+      <w:pPr>
+        <w:numPr>
+          <w:ilvl w:val="0"/>
+          <w:numId w:val="2"/>
+        </w:numPr>
+      </w:pPr>
+      <w:r>
+        <w:t>Concentración de patrones de sesgo.</w:t>
+      </w:r>
+    </w:p>
+    <w:p>
+      <w:pPr>
+        <w:numPr>
+          <w:ilvl w:val="0"/>
+          <w:numId w:val="2"/>
+        </w:numPr>
+      </w:pPr>
+      <w:r>
+        <w:t>Reducción de diversidad cognitiva.</w:t>
+      </w:r>
+    </w:p>
+    <w:p>
+      <w:pPr>
+        <w:numPr>
+          <w:ilvl w:val="0"/>
+          <w:numId w:val="2"/>
+        </w:numPr>
+      </w:pPr>
+      <w:r>
+        <w:t>Pérdida de pluralidad semántica.</w:t>
+      </w:r>
+    </w:p>
+    <w:p>
+      <w:pPr>
+        <w:numPr>
+          <w:ilvl w:val="0"/>
+          <w:numId w:val="2"/>
+        </w:numPr>
+      </w:pPr>
+      <w:r>
+        <w:lastRenderedPageBreak/>
+        <w:t>Colapso de distinción entre conceptos inicialmente diferenciados.</w:t>
+      </w:r>
+    </w:p>
+    <w:p>
+      <w:r>
+        <w:t xml:space="preserve">Actualmente existen métricas para evaluar precisión, rendimiento, robustez o </w:t>
+      </w:r>
+      <w:proofErr w:type="spellStart"/>
+      <w:r>
+        <w:t>fairness</w:t>
+      </w:r>
+      <w:proofErr w:type="spellEnd"/>
+      <w:r>
+        <w:t>.</w:t>
+      </w:r>
+    </w:p>
+    <w:p>
+      <w:r>
+        <w:t>Sin embargo, existe una oportunidad para desarrollar herramientas específicamente orientadas a cuantificar la convergencia semántica y la pérdida progresiva de diferenciación representacional.</w:t>
+      </w:r>
+    </w:p>
+    <w:p>
       <w:pPr>
         <w:rPr>
-          <w:rFonts w:ascii="Times New Roman" w:hAnsi="Times New Roman" w:cs="Times New Roman"/>
-        </w:rPr>
-      </w:pPr>
-      <w:r>
-        <w:rPr>
-          <w:rFonts w:ascii="Times New Roman" w:hAnsi="Times New Roman" w:cs="Times New Roman"/>
-        </w:rPr>
-        <w:t>Los modelos de inteligencia artificial actuales son sometidos a múltiples procesos de entrenamiento, ajuste, alineamiento y optimización.</w:t>
-      </w:r>
-    </w:p>
-    <w:p>
-      <w:pPr>
-        <w:rPr>
-          <w:rFonts w:ascii="Times New Roman" w:hAnsi="Times New Roman" w:cs="Times New Roman"/>
-        </w:rPr>
-      </w:pPr>
-      <w:r>
-        <w:rPr>
-          <w:rFonts w:ascii="Times New Roman" w:hAnsi="Times New Roman" w:cs="Times New Roman"/>
-        </w:rPr>
-        <w:t>Estos procesos pueden generar fenómenos de:</w:t>
-      </w:r>
-    </w:p>
-    <w:p>
-      <w:pPr>
-        <w:numPr>
-          <w:ilvl w:val="0"/>
-          <w:numId w:val="2"/>
-        </w:numPr>
-        <w:rPr>
-          <w:rFonts w:ascii="Times New Roman" w:hAnsi="Times New Roman" w:cs="Times New Roman"/>
-        </w:rPr>
-      </w:pPr>
-      <w:r>
-        <w:rPr>
-          <w:rFonts w:ascii="Times New Roman" w:hAnsi="Times New Roman" w:cs="Times New Roman"/>
-        </w:rPr>
-        <w:t>Homogeneización de respuestas.</w:t>
-      </w:r>
-    </w:p>
-    <w:p>
-      <w:pPr>
-        <w:numPr>
-          <w:ilvl w:val="0"/>
-          <w:numId w:val="2"/>
-        </w:numPr>
-        <w:rPr>
-          <w:rFonts w:ascii="Times New Roman" w:hAnsi="Times New Roman" w:cs="Times New Roman"/>
-        </w:rPr>
-      </w:pPr>
-      <w:r>
-        <w:rPr>
-          <w:rFonts w:ascii="Times New Roman" w:hAnsi="Times New Roman" w:cs="Times New Roman"/>
-        </w:rPr>
-        <w:t>Convergencia de representaciones internas.</w:t>
-      </w:r>
-    </w:p>
-    <w:p>
-      <w:pPr>
-        <w:numPr>
-          <w:ilvl w:val="0"/>
-          <w:numId w:val="2"/>
-        </w:numPr>
-        <w:rPr>
-          <w:rFonts w:ascii="Times New Roman" w:hAnsi="Times New Roman" w:cs="Times New Roman"/>
-        </w:rPr>
-      </w:pPr>
-      <w:r>
-        <w:rPr>
-          <w:rFonts w:ascii="Times New Roman" w:hAnsi="Times New Roman" w:cs="Times New Roman"/>
-        </w:rPr>
-        <w:t>Concentración de patrones de sesgo.</w:t>
-      </w:r>
-    </w:p>
-    <w:p>
-      <w:pPr>
-        <w:numPr>
-          <w:ilvl w:val="0"/>
-          <w:numId w:val="2"/>
-        </w:numPr>
-        <w:rPr>
-          <w:rFonts w:ascii="Times New Roman" w:hAnsi="Times New Roman" w:cs="Times New Roman"/>
-        </w:rPr>
-      </w:pPr>
-      <w:r>
-        <w:rPr>
-          <w:rFonts w:ascii="Times New Roman" w:hAnsi="Times New Roman" w:cs="Times New Roman"/>
-        </w:rPr>
-        <w:t>Reducción de diversidad cognitiva.</w:t>
-      </w:r>
-    </w:p>
-    <w:p>
-      <w:pPr>
-        <w:numPr>
-          <w:ilvl w:val="0"/>
-          <w:numId w:val="2"/>
-        </w:numPr>
-        <w:rPr>
-          <w:rFonts w:ascii="Times New Roman" w:hAnsi="Times New Roman" w:cs="Times New Roman"/>
-        </w:rPr>
-      </w:pPr>
-      <w:r>
-        <w:rPr>
-          <w:rFonts w:ascii="Times New Roman" w:hAnsi="Times New Roman" w:cs="Times New Roman"/>
-        </w:rPr>
-        <w:t>Pérdida de pluralidad semántica.</w:t>
-      </w:r>
-    </w:p>
-    <w:p>
-      <w:pPr>
-        <w:numPr>
-          <w:ilvl w:val="0"/>
-          <w:numId w:val="2"/>
-        </w:numPr>
-        <w:rPr>
-          <w:rFonts w:ascii="Times New Roman" w:hAnsi="Times New Roman" w:cs="Times New Roman"/>
-        </w:rPr>
-      </w:pPr>
-      <w:r>
-        <w:rPr>
-          <w:rFonts w:ascii="Times New Roman" w:hAnsi="Times New Roman" w:cs="Times New Roman"/>
-        </w:rPr>
-        <w:t>Colapso de distinción entre conceptos inicialmente diferenciados.</w:t>
-      </w:r>
-    </w:p>
-    <w:p>
-      <w:pPr>
-        <w:rPr>
-          <w:rFonts w:ascii="Times New Roman" w:hAnsi="Times New Roman" w:cs="Times New Roman"/>
-        </w:rPr>
-      </w:pPr>
-      <w:r>
-        <w:rPr>
-          <w:rFonts w:ascii="Times New Roman" w:hAnsi="Times New Roman" w:cs="Times New Roman"/>
-        </w:rPr>
-        <w:t xml:space="preserve">Actualmente existen métricas para evaluar precisión, rendimiento, robustez o </w:t>
-      </w:r>
-      <w:proofErr w:type="spellStart"/>
-      <w:r>
-        <w:rPr>
-          <w:rFonts w:ascii="Times New Roman" w:hAnsi="Times New Roman" w:cs="Times New Roman"/>
-        </w:rPr>
-        <w:t>fairness</w:t>
-      </w:r>
-      <w:proofErr w:type="spellEnd"/>
-      <w:r>
-        <w:rPr>
-          <w:rFonts w:ascii="Times New Roman" w:hAnsi="Times New Roman" w:cs="Times New Roman"/>
-        </w:rPr>
-        <w:t>.</w:t>
-      </w:r>
-    </w:p>
-    <w:p>
-      <w:pPr>
-        <w:rPr>
-          <w:rFonts w:ascii="Times New Roman" w:hAnsi="Times New Roman" w:cs="Times New Roman"/>
-        </w:rPr>
-      </w:pPr>
-      <w:r>
-        <w:rPr>
-          <w:rFonts w:ascii="Times New Roman" w:hAnsi="Times New Roman" w:cs="Times New Roman"/>
-        </w:rPr>
-        <w:lastRenderedPageBreak/>
-        <w:t>Sin embargo, existe una oportunidad para desarrollar herramientas específicamente orientadas a cuantificar la convergencia semántica y la pérdida progresiva de diferenciación representacional.</w:t>
-      </w:r>
-    </w:p>
-    <w:p>
-      <w:pPr>
-        <w:rPr>
-          <w:rFonts w:ascii="Times New Roman" w:hAnsi="Times New Roman" w:cs="Times New Roman"/>
           <w:b/>
           <w:bCs/>
         </w:rPr>
       </w:pPr>
       <w:r>
         <w:rPr>
-          <w:rFonts w:ascii="Times New Roman" w:hAnsi="Times New Roman" w:cs="Times New Roman"/>
           <w:b/>
           <w:bCs/>
         </w:rPr>
@@ -428,7 +242,6 @@
       </w:r>
       <w:r>
         <w:rPr>
-          <w:rFonts w:ascii="Times New Roman" w:hAnsi="Times New Roman" w:cs="Times New Roman"/>
           <w:b/>
           <w:bCs/>
         </w:rPr>
@@ -437,226 +250,132 @@
       </w:r>
     </w:p>
     <w:p>
+      <w:r>
+        <w:t xml:space="preserve">Continuum </w:t>
+      </w:r>
+      <w:proofErr w:type="spellStart"/>
+      <w:r>
+        <w:t>Semantic</w:t>
+      </w:r>
+      <w:proofErr w:type="spellEnd"/>
+      <w:r>
+        <w:t xml:space="preserve"> </w:t>
+      </w:r>
+      <w:proofErr w:type="spellStart"/>
+      <w:r>
+        <w:t>Index</w:t>
+      </w:r>
+      <w:proofErr w:type="spellEnd"/>
+      <w:r>
+        <w:t xml:space="preserve"> (CSI)</w:t>
+      </w:r>
+    </w:p>
+    <w:p>
+      <w:r>
+        <w:t>Definición:</w:t>
+      </w:r>
+    </w:p>
+    <w:p>
+      <w:r>
+        <w:t xml:space="preserve">El Continuum </w:t>
+      </w:r>
+      <w:proofErr w:type="spellStart"/>
+      <w:r>
+        <w:t>Semantic</w:t>
+      </w:r>
+      <w:proofErr w:type="spellEnd"/>
+      <w:r>
+        <w:t xml:space="preserve"> </w:t>
+      </w:r>
+      <w:proofErr w:type="spellStart"/>
+      <w:r>
+        <w:t>Index</w:t>
+      </w:r>
+      <w:proofErr w:type="spellEnd"/>
+      <w:r>
+        <w:t xml:space="preserve"> (CSI) es un indicador destinado a medir el grado de pérdida de distinción semántica, diversidad cognitiva y pluralidad representacional en sistemas de inteligencia artificial.</w:t>
+      </w:r>
+    </w:p>
+    <w:p>
+      <w:r>
+        <w:t>Objetivos:</w:t>
+      </w:r>
+    </w:p>
+    <w:p>
+      <w:pPr>
+        <w:numPr>
+          <w:ilvl w:val="0"/>
+          <w:numId w:val="3"/>
+        </w:numPr>
+      </w:pPr>
+      <w:r>
+        <w:t>Detectar convergencia excesiva.</w:t>
+      </w:r>
+    </w:p>
+    <w:p>
+      <w:pPr>
+        <w:numPr>
+          <w:ilvl w:val="0"/>
+          <w:numId w:val="3"/>
+        </w:numPr>
+      </w:pPr>
+      <w:r>
+        <w:t>Evaluar homogeneización semántica.</w:t>
+      </w:r>
+    </w:p>
+    <w:p>
+      <w:pPr>
+        <w:numPr>
+          <w:ilvl w:val="0"/>
+          <w:numId w:val="3"/>
+        </w:numPr>
+      </w:pPr>
+      <w:r>
+        <w:t>Medir pérdida de diversidad.</w:t>
+      </w:r>
+    </w:p>
+    <w:p>
+      <w:pPr>
+        <w:numPr>
+          <w:ilvl w:val="0"/>
+          <w:numId w:val="3"/>
+        </w:numPr>
+      </w:pPr>
+      <w:r>
+        <w:t>Comparar modelos.</w:t>
+      </w:r>
+    </w:p>
+    <w:p>
+      <w:pPr>
+        <w:numPr>
+          <w:ilvl w:val="0"/>
+          <w:numId w:val="3"/>
+        </w:numPr>
+      </w:pPr>
+      <w:r>
+        <w:t>Monitorizar evolución temporal.</w:t>
+      </w:r>
+    </w:p>
+    <w:p>
+      <w:pPr>
+        <w:numPr>
+          <w:ilvl w:val="0"/>
+          <w:numId w:val="3"/>
+        </w:numPr>
+      </w:pPr>
+      <w:r>
+        <w:t>Facilitar auditorías de IA.</w:t>
+      </w:r>
+    </w:p>
+    <w:p>
       <w:pPr>
         <w:rPr>
-          <w:rFonts w:ascii="Times New Roman" w:hAnsi="Times New Roman" w:cs="Times New Roman"/>
-        </w:rPr>
-      </w:pPr>
-      <w:r>
-        <w:rPr>
-          <w:rFonts w:ascii="Times New Roman" w:hAnsi="Times New Roman" w:cs="Times New Roman"/>
-        </w:rPr>
-        <w:t xml:space="preserve">Continuum </w:t>
-      </w:r>
-      <w:proofErr w:type="spellStart"/>
-      <w:r>
-        <w:rPr>
-          <w:rFonts w:ascii="Times New Roman" w:hAnsi="Times New Roman" w:cs="Times New Roman"/>
-        </w:rPr>
-        <w:t>Semantic</w:t>
-      </w:r>
-      <w:proofErr w:type="spellEnd"/>
-      <w:r>
-        <w:rPr>
-          <w:rFonts w:ascii="Times New Roman" w:hAnsi="Times New Roman" w:cs="Times New Roman"/>
-        </w:rPr>
-        <w:t xml:space="preserve"> </w:t>
-      </w:r>
-      <w:proofErr w:type="spellStart"/>
-      <w:r>
-        <w:rPr>
-          <w:rFonts w:ascii="Times New Roman" w:hAnsi="Times New Roman" w:cs="Times New Roman"/>
-        </w:rPr>
-        <w:t>Index</w:t>
-      </w:r>
-      <w:proofErr w:type="spellEnd"/>
-      <w:r>
-        <w:rPr>
-          <w:rFonts w:ascii="Times New Roman" w:hAnsi="Times New Roman" w:cs="Times New Roman"/>
-        </w:rPr>
-        <w:t xml:space="preserve"> (CSI)</w:t>
-      </w:r>
-    </w:p>
-    <w:p>
-      <w:pPr>
-        <w:rPr>
-          <w:rFonts w:ascii="Times New Roman" w:hAnsi="Times New Roman" w:cs="Times New Roman"/>
-        </w:rPr>
-      </w:pPr>
-      <w:r>
-        <w:rPr>
-          <w:rFonts w:ascii="Times New Roman" w:hAnsi="Times New Roman" w:cs="Times New Roman"/>
-        </w:rPr>
-        <w:t>Definición:</w:t>
-      </w:r>
-    </w:p>
-    <w:p>
-      <w:pPr>
-        <w:rPr>
-          <w:rFonts w:ascii="Times New Roman" w:hAnsi="Times New Roman" w:cs="Times New Roman"/>
-        </w:rPr>
-      </w:pPr>
-      <w:r>
-        <w:rPr>
-          <w:rFonts w:ascii="Times New Roman" w:hAnsi="Times New Roman" w:cs="Times New Roman"/>
-        </w:rPr>
-        <w:t xml:space="preserve">El Continuum </w:t>
-      </w:r>
-      <w:proofErr w:type="spellStart"/>
-      <w:r>
-        <w:rPr>
-          <w:rFonts w:ascii="Times New Roman" w:hAnsi="Times New Roman" w:cs="Times New Roman"/>
-        </w:rPr>
-        <w:t>Semantic</w:t>
-      </w:r>
-      <w:proofErr w:type="spellEnd"/>
-      <w:r>
-        <w:rPr>
-          <w:rFonts w:ascii="Times New Roman" w:hAnsi="Times New Roman" w:cs="Times New Roman"/>
-        </w:rPr>
-        <w:t xml:space="preserve"> </w:t>
-      </w:r>
-      <w:proofErr w:type="spellStart"/>
-      <w:r>
-        <w:rPr>
-          <w:rFonts w:ascii="Times New Roman" w:hAnsi="Times New Roman" w:cs="Times New Roman"/>
-        </w:rPr>
-        <w:t>Index</w:t>
-      </w:r>
-      <w:proofErr w:type="spellEnd"/>
-      <w:r>
-        <w:rPr>
-          <w:rFonts w:ascii="Times New Roman" w:hAnsi="Times New Roman" w:cs="Times New Roman"/>
-        </w:rPr>
-        <w:t xml:space="preserve"> (CSI) es un indicador destinado a medir el grado de pérdida de distinción semántica, diversidad cognitiva y pluralidad representacional en sistemas de inteligencia artificial.</w:t>
-      </w:r>
-    </w:p>
-    <w:p>
-      <w:pPr>
-        <w:rPr>
-          <w:rFonts w:ascii="Times New Roman" w:hAnsi="Times New Roman" w:cs="Times New Roman"/>
-        </w:rPr>
-      </w:pPr>
-      <w:r>
-        <w:rPr>
-          <w:rFonts w:ascii="Times New Roman" w:hAnsi="Times New Roman" w:cs="Times New Roman"/>
-        </w:rPr>
-        <w:t>Objetivos:</w:t>
-      </w:r>
-    </w:p>
-    <w:p>
-      <w:pPr>
-        <w:numPr>
-          <w:ilvl w:val="0"/>
-          <w:numId w:val="3"/>
-        </w:numPr>
-        <w:rPr>
-          <w:rFonts w:ascii="Times New Roman" w:hAnsi="Times New Roman" w:cs="Times New Roman"/>
-        </w:rPr>
-      </w:pPr>
-      <w:r>
-        <w:rPr>
-          <w:rFonts w:ascii="Times New Roman" w:hAnsi="Times New Roman" w:cs="Times New Roman"/>
-        </w:rPr>
-        <w:t>Detectar convergencia excesiva.</w:t>
-      </w:r>
-    </w:p>
-    <w:p>
-      <w:pPr>
-        <w:numPr>
-          <w:ilvl w:val="0"/>
-          <w:numId w:val="3"/>
-        </w:numPr>
-        <w:rPr>
-          <w:rFonts w:ascii="Times New Roman" w:hAnsi="Times New Roman" w:cs="Times New Roman"/>
-        </w:rPr>
-      </w:pPr>
-      <w:r>
-        <w:rPr>
-          <w:rFonts w:ascii="Times New Roman" w:hAnsi="Times New Roman" w:cs="Times New Roman"/>
-        </w:rPr>
-        <w:t>Evaluar homogeneización semántica.</w:t>
-      </w:r>
-    </w:p>
-    <w:p>
-      <w:pPr>
-        <w:numPr>
-          <w:ilvl w:val="0"/>
-          <w:numId w:val="3"/>
-        </w:numPr>
-        <w:rPr>
-          <w:rFonts w:ascii="Times New Roman" w:hAnsi="Times New Roman" w:cs="Times New Roman"/>
-        </w:rPr>
-      </w:pPr>
-      <w:r>
-        <w:rPr>
-          <w:rFonts w:ascii="Times New Roman" w:hAnsi="Times New Roman" w:cs="Times New Roman"/>
-        </w:rPr>
-        <w:t>Medir pérdida de diversidad.</w:t>
-      </w:r>
-    </w:p>
-    <w:p>
-      <w:pPr>
-        <w:numPr>
-          <w:ilvl w:val="0"/>
-          <w:numId w:val="3"/>
-        </w:numPr>
-        <w:rPr>
-          <w:rFonts w:ascii="Times New Roman" w:hAnsi="Times New Roman" w:cs="Times New Roman"/>
-        </w:rPr>
-      </w:pPr>
-      <w:r>
-        <w:rPr>
-          <w:rFonts w:ascii="Times New Roman" w:hAnsi="Times New Roman" w:cs="Times New Roman"/>
-        </w:rPr>
-        <w:t>Comparar modelos.</w:t>
-      </w:r>
-    </w:p>
-    <w:p>
-      <w:pPr>
-        <w:numPr>
-          <w:ilvl w:val="0"/>
-          <w:numId w:val="3"/>
-        </w:numPr>
-        <w:rPr>
-          <w:rFonts w:ascii="Times New Roman" w:hAnsi="Times New Roman" w:cs="Times New Roman"/>
-        </w:rPr>
-      </w:pPr>
-      <w:r>
-        <w:rPr>
-          <w:rFonts w:ascii="Times New Roman" w:hAnsi="Times New Roman" w:cs="Times New Roman"/>
-        </w:rPr>
-        <w:t>Monitorizar evolución temporal.</w:t>
-      </w:r>
-    </w:p>
-    <w:p>
-      <w:pPr>
-        <w:numPr>
-          <w:ilvl w:val="0"/>
-          <w:numId w:val="3"/>
-        </w:numPr>
-        <w:rPr>
-          <w:rFonts w:ascii="Times New Roman" w:hAnsi="Times New Roman" w:cs="Times New Roman"/>
-        </w:rPr>
-      </w:pPr>
-      <w:r>
-        <w:rPr>
-          <w:rFonts w:ascii="Times New Roman" w:hAnsi="Times New Roman" w:cs="Times New Roman"/>
-        </w:rPr>
-        <w:t>Facilitar auditorías de IA.</w:t>
-      </w:r>
-    </w:p>
-    <w:p>
-      <w:pPr>
-        <w:rPr>
-          <w:rFonts w:ascii="Times New Roman" w:hAnsi="Times New Roman" w:cs="Times New Roman"/>
           <w:b/>
           <w:bCs/>
         </w:rPr>
       </w:pPr>
       <w:r>
         <w:rPr>
-          <w:rFonts w:ascii="Times New Roman" w:hAnsi="Times New Roman" w:cs="Times New Roman"/>
           <w:b/>
           <w:bCs/>
         </w:rPr>
@@ -664,7 +383,6 @@
       </w:r>
       <w:r>
         <w:rPr>
-          <w:rFonts w:ascii="Times New Roman" w:hAnsi="Times New Roman" w:cs="Times New Roman"/>
           <w:b/>
           <w:bCs/>
         </w:rPr>
@@ -673,123 +391,478 @@
       </w:r>
     </w:p>
     <w:p>
+      <w:r>
+        <w:t>La hipótesis central del proyecto sostiene que determinados sistemas de inteligencia artificial pueden evolucionar hacia estados progresivamente más homogéneos cuando son sometidos a mecanismos iterativos de agregación, alineamiento y difusión representacional.</w:t>
+      </w:r>
+    </w:p>
+    <w:p>
+      <w:r>
+        <w:t>Como consecuencia:</w:t>
+      </w:r>
+    </w:p>
+    <w:p>
+      <w:pPr>
+        <w:numPr>
+          <w:ilvl w:val="0"/>
+          <w:numId w:val="4"/>
+        </w:numPr>
+      </w:pPr>
+      <w:r>
+        <w:t>Disminuye la diferenciación entre representaciones.</w:t>
+      </w:r>
+    </w:p>
+    <w:p>
+      <w:pPr>
+        <w:numPr>
+          <w:ilvl w:val="0"/>
+          <w:numId w:val="4"/>
+        </w:numPr>
+      </w:pPr>
+      <w:r>
+        <w:t>Se reduce la diversidad semántica observable.</w:t>
+      </w:r>
+    </w:p>
+    <w:p>
+      <w:pPr>
+        <w:numPr>
+          <w:ilvl w:val="0"/>
+          <w:numId w:val="4"/>
+        </w:numPr>
+      </w:pPr>
+      <w:r>
+        <w:t>Aumenta la convergencia de respuestas.</w:t>
+      </w:r>
+    </w:p>
+    <w:p>
+      <w:pPr>
+        <w:numPr>
+          <w:ilvl w:val="0"/>
+          <w:numId w:val="4"/>
+        </w:numPr>
+      </w:pPr>
+      <w:r>
+        <w:lastRenderedPageBreak/>
+        <w:t>Aparecen patrones dominantes más uniformes.</w:t>
+      </w:r>
+    </w:p>
+    <w:p>
+      <w:r>
+        <w:t>CSI pretende proporcionar un marco operativo para observar y cuantificar dichos fenómenos.</w:t>
+      </w:r>
+    </w:p>
+    <w:p>
       <w:pPr>
         <w:rPr>
-          <w:rFonts w:ascii="Times New Roman" w:hAnsi="Times New Roman" w:cs="Times New Roman"/>
-        </w:rPr>
-      </w:pPr>
-      <w:r>
-        <w:rPr>
-          <w:rFonts w:ascii="Times New Roman" w:hAnsi="Times New Roman" w:cs="Times New Roman"/>
-        </w:rPr>
-        <w:t>La hipótesis central del proyecto sostiene que determinados sistemas de inteligencia artificial pueden evolucionar hacia estados progresivamente más homogéneos cuando son sometidos a mecanismos iterativos de agregación, alineamiento y difusión representacional.</w:t>
-      </w:r>
-    </w:p>
-    <w:p>
-      <w:pPr>
-        <w:rPr>
-          <w:rFonts w:ascii="Times New Roman" w:hAnsi="Times New Roman" w:cs="Times New Roman"/>
-        </w:rPr>
-      </w:pPr>
-      <w:r>
-        <w:rPr>
-          <w:rFonts w:ascii="Times New Roman" w:hAnsi="Times New Roman" w:cs="Times New Roman"/>
-        </w:rPr>
-        <w:t>Como consecuencia:</w:t>
-      </w:r>
-    </w:p>
-    <w:p>
-      <w:pPr>
-        <w:numPr>
-          <w:ilvl w:val="0"/>
-          <w:numId w:val="4"/>
-        </w:numPr>
-        <w:rPr>
-          <w:rFonts w:ascii="Times New Roman" w:hAnsi="Times New Roman" w:cs="Times New Roman"/>
-        </w:rPr>
-      </w:pPr>
-      <w:r>
-        <w:rPr>
-          <w:rFonts w:ascii="Times New Roman" w:hAnsi="Times New Roman" w:cs="Times New Roman"/>
-        </w:rPr>
-        <w:t>Disminuye la diferenciación entre representaciones.</w:t>
-      </w:r>
-    </w:p>
-    <w:p>
-      <w:pPr>
-        <w:numPr>
-          <w:ilvl w:val="0"/>
-          <w:numId w:val="4"/>
-        </w:numPr>
-        <w:rPr>
-          <w:rFonts w:ascii="Times New Roman" w:hAnsi="Times New Roman" w:cs="Times New Roman"/>
-        </w:rPr>
-      </w:pPr>
-      <w:r>
-        <w:rPr>
-          <w:rFonts w:ascii="Times New Roman" w:hAnsi="Times New Roman" w:cs="Times New Roman"/>
-        </w:rPr>
-        <w:t>Se reduce la diversidad semántica observable.</w:t>
-      </w:r>
-    </w:p>
-    <w:p>
-      <w:pPr>
-        <w:numPr>
-          <w:ilvl w:val="0"/>
-          <w:numId w:val="4"/>
-        </w:numPr>
-        <w:rPr>
-          <w:rFonts w:ascii="Times New Roman" w:hAnsi="Times New Roman" w:cs="Times New Roman"/>
-        </w:rPr>
-      </w:pPr>
-      <w:r>
-        <w:rPr>
-          <w:rFonts w:ascii="Times New Roman" w:hAnsi="Times New Roman" w:cs="Times New Roman"/>
-        </w:rPr>
-        <w:t>Aumenta la convergencia de respuestas.</w:t>
-      </w:r>
-    </w:p>
-    <w:p>
-      <w:pPr>
-        <w:numPr>
-          <w:ilvl w:val="0"/>
-          <w:numId w:val="4"/>
-        </w:numPr>
-        <w:rPr>
-          <w:rFonts w:ascii="Times New Roman" w:hAnsi="Times New Roman" w:cs="Times New Roman"/>
-        </w:rPr>
-      </w:pPr>
-      <w:r>
-        <w:rPr>
-          <w:rFonts w:ascii="Times New Roman" w:hAnsi="Times New Roman" w:cs="Times New Roman"/>
-        </w:rPr>
-        <w:t>Aparecen patrones dominantes más uniformes.</w:t>
-      </w:r>
-    </w:p>
-    <w:p>
-      <w:pPr>
-        <w:rPr>
-          <w:rFonts w:ascii="Times New Roman" w:hAnsi="Times New Roman" w:cs="Times New Roman"/>
-        </w:rPr>
-      </w:pPr>
-      <w:r>
-        <w:rPr>
-          <w:rFonts w:ascii="Times New Roman" w:hAnsi="Times New Roman" w:cs="Times New Roman"/>
-        </w:rPr>
-        <w:t>CSI pretende proporcionar un marco operativo para observar y cuantificar dichos fenómenos.</w:t>
-      </w:r>
-    </w:p>
-    <w:p>
-      <w:pPr>
-        <w:rPr>
-          <w:rFonts w:ascii="Times New Roman" w:hAnsi="Times New Roman" w:cs="Times New Roman"/>
           <w:b/>
           <w:bCs/>
         </w:rPr>
       </w:pPr>
       <w:r>
         <w:rPr>
-          <w:rFonts w:ascii="Times New Roman" w:hAnsi="Times New Roman" w:cs="Times New Roman"/>
+          <w:b/>
+          <w:bCs/>
+        </w:rPr>
+        <w:t>======================================================================</w:t>
+      </w:r>
+      <w:r>
+        <w:rPr>
+          <w:b/>
+          <w:bCs/>
+        </w:rPr>
+        <w:br/>
+        <w:t>5. ¿POR QUÉ CSI ES DIFERENTE?</w:t>
+      </w:r>
+    </w:p>
+    <w:p>
+      <w:r>
+        <w:t>Esta sección constituye el núcleo estratégico del proyecto.</w:t>
+      </w:r>
+    </w:p>
+    <w:p>
+      <w:r>
+        <w:t>CSI no pretende competir con métricas tradicionales de rendimiento.</w:t>
+      </w:r>
+    </w:p>
+    <w:p>
+      <w:r>
+        <w:t xml:space="preserve">Tampoco pretende sustituir métricas de </w:t>
+      </w:r>
+      <w:proofErr w:type="spellStart"/>
+      <w:r>
+        <w:t>fairness</w:t>
+      </w:r>
+      <w:proofErr w:type="spellEnd"/>
+      <w:r>
+        <w:t xml:space="preserve"> o robustez.</w:t>
+      </w:r>
+    </w:p>
+    <w:p>
+      <w:r>
+        <w:t>Su propósito es diferente.</w:t>
+      </w:r>
+    </w:p>
+    <w:p>
+      <w:r>
+        <w:t>Mientras otras métricas responden preguntas como:</w:t>
+      </w:r>
+    </w:p>
+    <w:p>
+      <w:pPr>
+        <w:numPr>
+          <w:ilvl w:val="0"/>
+          <w:numId w:val="5"/>
+        </w:numPr>
+      </w:pPr>
+      <w:r>
+        <w:t>¿Es correcto el resultado?</w:t>
+      </w:r>
+    </w:p>
+    <w:p>
+      <w:pPr>
+        <w:numPr>
+          <w:ilvl w:val="0"/>
+          <w:numId w:val="5"/>
+        </w:numPr>
+      </w:pPr>
+      <w:r>
+        <w:t>¿Es robusto el modelo?</w:t>
+      </w:r>
+    </w:p>
+    <w:p>
+      <w:pPr>
+        <w:numPr>
+          <w:ilvl w:val="0"/>
+          <w:numId w:val="5"/>
+        </w:numPr>
+      </w:pPr>
+      <w:r>
+        <w:t>¿Es preciso?</w:t>
+      </w:r>
+    </w:p>
+    <w:p>
+      <w:pPr>
+        <w:numPr>
+          <w:ilvl w:val="0"/>
+          <w:numId w:val="5"/>
+        </w:numPr>
+      </w:pPr>
+      <w:r>
+        <w:t>¿Existe sesgo?</w:t>
+      </w:r>
+    </w:p>
+    <w:p>
+      <w:r>
+        <w:t>CSI pretende responder una pregunta distinta:</w:t>
+      </w:r>
+    </w:p>
+    <w:p>
+      <w:r>
+        <w:t>"¿Está perdiendo capacidad de mantener diferencias semánticas significativas?"</w:t>
+      </w:r>
+    </w:p>
+    <w:p>
+      <w:r>
+        <w:t>En otras palabras:</w:t>
+      </w:r>
+    </w:p>
+    <w:p>
+      <w:r>
+        <w:t>CSI no mide únicamente sesgo.</w:t>
+      </w:r>
+    </w:p>
+    <w:p>
+      <w:r>
+        <w:t>CSI pretende medir la dinámica de convergencia semántica que puede dar lugar a la homogeneización progresiva de representaciones.</w:t>
+      </w:r>
+    </w:p>
+    <w:p>
+      <w:r>
+        <w:t>Conceptualmente, el foco del proyecto es el fenómeno denominado:</w:t>
+      </w:r>
+    </w:p>
+    <w:p>
+      <w:r>
+        <w:t>COLAPSO DE DISTINCIÓN</w:t>
+      </w:r>
+    </w:p>
+    <w:p>
+      <w:r>
+        <w:t>Definición provisional:</w:t>
+      </w:r>
+    </w:p>
+    <w:p>
+      <w:r>
+        <w:t>Proceso mediante el cual representaciones inicialmente diferenciadas convergen progresivamente hacia estados semánticos más uniformes.</w:t>
+      </w:r>
+    </w:p>
+    <w:p>
+      <w:pPr>
+        <w:rPr>
+          <w:b/>
+          <w:bCs/>
+        </w:rPr>
+      </w:pPr>
+      <w:r>
+        <w:rPr>
+          <w:b/>
+          <w:bCs/>
+        </w:rPr>
+        <w:t>======================================================================</w:t>
+      </w:r>
+      <w:r>
+        <w:rPr>
+          <w:b/>
+          <w:bCs/>
+        </w:rPr>
+        <w:br/>
+        <w:t>6. PRODUCTOS PREVISTOS</w:t>
+      </w:r>
+    </w:p>
+    <w:p>
+      <w:r>
+        <w:t>A) CSI Audit</w:t>
+      </w:r>
+    </w:p>
+    <w:p>
+      <w:r>
+        <w:lastRenderedPageBreak/>
+        <w:t>Servicio profesional de auditoría.</w:t>
+      </w:r>
+    </w:p>
+    <w:p>
+      <w:r>
+        <w:t>Incluye:</w:t>
+      </w:r>
+    </w:p>
+    <w:p>
+      <w:pPr>
+        <w:numPr>
+          <w:ilvl w:val="0"/>
+          <w:numId w:val="6"/>
+        </w:numPr>
+      </w:pPr>
+      <w:r>
+        <w:t>Análisis de modelos.</w:t>
+      </w:r>
+    </w:p>
+    <w:p>
+      <w:pPr>
+        <w:numPr>
+          <w:ilvl w:val="0"/>
+          <w:numId w:val="6"/>
+        </w:numPr>
+      </w:pPr>
+      <w:r>
+        <w:t>Evaluación de convergencia semántica.</w:t>
+      </w:r>
+    </w:p>
+    <w:p>
+      <w:pPr>
+        <w:numPr>
+          <w:ilvl w:val="0"/>
+          <w:numId w:val="6"/>
+        </w:numPr>
+      </w:pPr>
+      <w:r>
+        <w:t>Informes de riesgo.</w:t>
+      </w:r>
+    </w:p>
+    <w:p>
+      <w:pPr>
+        <w:numPr>
+          <w:ilvl w:val="0"/>
+          <w:numId w:val="6"/>
+        </w:numPr>
+      </w:pPr>
+      <w:r>
+        <w:t>Recomendaciones.</w:t>
+      </w:r>
+    </w:p>
+    <w:p>
+      <w:r>
+        <w:t xml:space="preserve">B) CSI </w:t>
+      </w:r>
+      <w:proofErr w:type="spellStart"/>
+      <w:r>
+        <w:t>Compliance</w:t>
+      </w:r>
+      <w:proofErr w:type="spellEnd"/>
+    </w:p>
+    <w:p>
+      <w:r>
+        <w:t>Herramienta orientada a gobernanza y cumplimiento normativo.</w:t>
+      </w:r>
+    </w:p>
+    <w:p>
+      <w:r>
+        <w:t>C) CSI Monitor</w:t>
+      </w:r>
+    </w:p>
+    <w:p>
+      <w:r>
+        <w:t>Sistema de monitorización continua.</w:t>
+      </w:r>
+    </w:p>
+    <w:p>
+      <w:r>
+        <w:t>D) CSI API</w:t>
+      </w:r>
+    </w:p>
+    <w:p>
+      <w:r>
+        <w:t>Integración con aplicaciones de terceros.</w:t>
+      </w:r>
+    </w:p>
+    <w:p>
+      <w:r>
+        <w:t xml:space="preserve">E) CSI </w:t>
+      </w:r>
+      <w:proofErr w:type="spellStart"/>
+      <w:r>
+        <w:t>Research</w:t>
+      </w:r>
+      <w:proofErr w:type="spellEnd"/>
+    </w:p>
+    <w:p>
+      <w:r>
+        <w:t>Licencias académicas y de investigación.</w:t>
+      </w:r>
+    </w:p>
+    <w:p>
+      <w:pPr>
+        <w:rPr>
+          <w:b/>
+          <w:bCs/>
+        </w:rPr>
+      </w:pPr>
+      <w:r>
+        <w:rPr>
+          <w:b/>
+          <w:bCs/>
+        </w:rPr>
+        <w:t>======================================================================</w:t>
+      </w:r>
+      <w:r>
+        <w:rPr>
+          <w:b/>
+          <w:bCs/>
+        </w:rPr>
+        <w:br/>
+        <w:t>7. CLIENTES OBJETIVO</w:t>
+      </w:r>
+    </w:p>
+    <w:p>
+      <w:r>
+        <w:t>Fase inicial:</w:t>
+      </w:r>
+    </w:p>
+    <w:p>
+      <w:pPr>
+        <w:numPr>
+          <w:ilvl w:val="0"/>
+          <w:numId w:val="7"/>
+        </w:numPr>
+      </w:pPr>
+      <w:r>
+        <w:t>Consultoras tecnológicas.</w:t>
+      </w:r>
+    </w:p>
+    <w:p>
+      <w:pPr>
+        <w:numPr>
+          <w:ilvl w:val="0"/>
+          <w:numId w:val="7"/>
+        </w:numPr>
+      </w:pPr>
+      <w:r>
+        <w:t>Consultoras de auditoría.</w:t>
+      </w:r>
+    </w:p>
+    <w:p>
+      <w:pPr>
+        <w:numPr>
+          <w:ilvl w:val="0"/>
+          <w:numId w:val="7"/>
+        </w:numPr>
+      </w:pPr>
+      <w:r>
+        <w:t>Consultoras de cumplimiento normativo.</w:t>
+      </w:r>
+    </w:p>
+    <w:p>
+      <w:r>
+        <w:t>Fase intermedia:</w:t>
+      </w:r>
+    </w:p>
+    <w:p>
+      <w:pPr>
+        <w:numPr>
+          <w:ilvl w:val="0"/>
+          <w:numId w:val="8"/>
+        </w:numPr>
+      </w:pPr>
+      <w:r>
+        <w:t>Grandes empresas que utilizan IA.</w:t>
+      </w:r>
+    </w:p>
+    <w:p>
+      <w:pPr>
+        <w:numPr>
+          <w:ilvl w:val="0"/>
+          <w:numId w:val="8"/>
+        </w:numPr>
+      </w:pPr>
+      <w:r>
+        <w:t>Organizaciones con modelos propios.</w:t>
+      </w:r>
+    </w:p>
+    <w:p>
+      <w:r>
+        <w:t>Fase avanzada:</w:t>
+      </w:r>
+    </w:p>
+    <w:p>
+      <w:pPr>
+        <w:numPr>
+          <w:ilvl w:val="0"/>
+          <w:numId w:val="9"/>
+        </w:numPr>
+      </w:pPr>
+      <w:r>
+        <w:t>Administraciones públicas.</w:t>
+      </w:r>
+    </w:p>
+    <w:p>
+      <w:pPr>
+        <w:numPr>
+          <w:ilvl w:val="0"/>
+          <w:numId w:val="9"/>
+        </w:numPr>
+      </w:pPr>
+      <w:r>
+        <w:t>Organismos reguladores.</w:t>
+      </w:r>
+    </w:p>
+    <w:p>
+      <w:pPr>
+        <w:numPr>
+          <w:ilvl w:val="0"/>
+          <w:numId w:val="9"/>
+        </w:numPr>
+      </w:pPr>
+      <w:r>
+        <w:t>Centros de investigación.</w:t>
+      </w:r>
+    </w:p>
+    <w:p>
+      <w:pPr>
+        <w:rPr>
+          <w:b/>
+          <w:bCs/>
+        </w:rPr>
+      </w:pPr>
+      <w:r>
+        <w:rPr>
           <w:b/>
           <w:bCs/>
         </w:rPr>
@@ -798,752 +871,6 @@
       </w:r>
       <w:r>
         <w:rPr>
-          <w:rFonts w:ascii="Times New Roman" w:hAnsi="Times New Roman" w:cs="Times New Roman"/>
-          <w:b/>
-          <w:bCs/>
-        </w:rPr>
-        <w:br/>
-        <w:t>5. ¿POR QUÉ CSI ES DIFERENTE?</w:t>
-      </w:r>
-    </w:p>
-    <w:p>
-      <w:pPr>
-        <w:rPr>
-          <w:rFonts w:ascii="Times New Roman" w:hAnsi="Times New Roman" w:cs="Times New Roman"/>
-        </w:rPr>
-      </w:pPr>
-      <w:r>
-        <w:rPr>
-          <w:rFonts w:ascii="Times New Roman" w:hAnsi="Times New Roman" w:cs="Times New Roman"/>
-        </w:rPr>
-        <w:t>Esta sección constituye el núcleo estratégico del proyecto.</w:t>
-      </w:r>
-    </w:p>
-    <w:p>
-      <w:pPr>
-        <w:rPr>
-          <w:rFonts w:ascii="Times New Roman" w:hAnsi="Times New Roman" w:cs="Times New Roman"/>
-        </w:rPr>
-      </w:pPr>
-      <w:r>
-        <w:rPr>
-          <w:rFonts w:ascii="Times New Roman" w:hAnsi="Times New Roman" w:cs="Times New Roman"/>
-        </w:rPr>
-        <w:t>CSI no pretende competir con métricas tradicionales de rendimiento.</w:t>
-      </w:r>
-    </w:p>
-    <w:p>
-      <w:pPr>
-        <w:rPr>
-          <w:rFonts w:ascii="Times New Roman" w:hAnsi="Times New Roman" w:cs="Times New Roman"/>
-        </w:rPr>
-      </w:pPr>
-      <w:r>
-        <w:rPr>
-          <w:rFonts w:ascii="Times New Roman" w:hAnsi="Times New Roman" w:cs="Times New Roman"/>
-        </w:rPr>
-        <w:t xml:space="preserve">Tampoco pretende sustituir métricas de </w:t>
-      </w:r>
-      <w:proofErr w:type="spellStart"/>
-      <w:r>
-        <w:rPr>
-          <w:rFonts w:ascii="Times New Roman" w:hAnsi="Times New Roman" w:cs="Times New Roman"/>
-        </w:rPr>
-        <w:t>fairness</w:t>
-      </w:r>
-      <w:proofErr w:type="spellEnd"/>
-      <w:r>
-        <w:rPr>
-          <w:rFonts w:ascii="Times New Roman" w:hAnsi="Times New Roman" w:cs="Times New Roman"/>
-        </w:rPr>
-        <w:t xml:space="preserve"> o robustez.</w:t>
-      </w:r>
-    </w:p>
-    <w:p>
-      <w:pPr>
-        <w:rPr>
-          <w:rFonts w:ascii="Times New Roman" w:hAnsi="Times New Roman" w:cs="Times New Roman"/>
-        </w:rPr>
-      </w:pPr>
-      <w:r>
-        <w:rPr>
-          <w:rFonts w:ascii="Times New Roman" w:hAnsi="Times New Roman" w:cs="Times New Roman"/>
-        </w:rPr>
-        <w:t>Su propósito es diferente.</w:t>
-      </w:r>
-    </w:p>
-    <w:p>
-      <w:pPr>
-        <w:rPr>
-          <w:rFonts w:ascii="Times New Roman" w:hAnsi="Times New Roman" w:cs="Times New Roman"/>
-        </w:rPr>
-      </w:pPr>
-      <w:r>
-        <w:rPr>
-          <w:rFonts w:ascii="Times New Roman" w:hAnsi="Times New Roman" w:cs="Times New Roman"/>
-        </w:rPr>
-        <w:t>Mientras otras métricas responden preguntas como:</w:t>
-      </w:r>
-    </w:p>
-    <w:p>
-      <w:pPr>
-        <w:numPr>
-          <w:ilvl w:val="0"/>
-          <w:numId w:val="5"/>
-        </w:numPr>
-        <w:rPr>
-          <w:rFonts w:ascii="Times New Roman" w:hAnsi="Times New Roman" w:cs="Times New Roman"/>
-        </w:rPr>
-      </w:pPr>
-      <w:r>
-        <w:rPr>
-          <w:rFonts w:ascii="Times New Roman" w:hAnsi="Times New Roman" w:cs="Times New Roman"/>
-        </w:rPr>
-        <w:t>¿Es correcto el resultado?</w:t>
-      </w:r>
-    </w:p>
-    <w:p>
-      <w:pPr>
-        <w:numPr>
-          <w:ilvl w:val="0"/>
-          <w:numId w:val="5"/>
-        </w:numPr>
-        <w:rPr>
-          <w:rFonts w:ascii="Times New Roman" w:hAnsi="Times New Roman" w:cs="Times New Roman"/>
-        </w:rPr>
-      </w:pPr>
-      <w:r>
-        <w:rPr>
-          <w:rFonts w:ascii="Times New Roman" w:hAnsi="Times New Roman" w:cs="Times New Roman"/>
-        </w:rPr>
-        <w:t>¿Es robusto el modelo?</w:t>
-      </w:r>
-    </w:p>
-    <w:p>
-      <w:pPr>
-        <w:numPr>
-          <w:ilvl w:val="0"/>
-          <w:numId w:val="5"/>
-        </w:numPr>
-        <w:rPr>
-          <w:rFonts w:ascii="Times New Roman" w:hAnsi="Times New Roman" w:cs="Times New Roman"/>
-        </w:rPr>
-      </w:pPr>
-      <w:r>
-        <w:rPr>
-          <w:rFonts w:ascii="Times New Roman" w:hAnsi="Times New Roman" w:cs="Times New Roman"/>
-        </w:rPr>
-        <w:t>¿Es preciso?</w:t>
-      </w:r>
-    </w:p>
-    <w:p>
-      <w:pPr>
-        <w:numPr>
-          <w:ilvl w:val="0"/>
-          <w:numId w:val="5"/>
-        </w:numPr>
-        <w:rPr>
-          <w:rFonts w:ascii="Times New Roman" w:hAnsi="Times New Roman" w:cs="Times New Roman"/>
-        </w:rPr>
-      </w:pPr>
-      <w:r>
-        <w:rPr>
-          <w:rFonts w:ascii="Times New Roman" w:hAnsi="Times New Roman" w:cs="Times New Roman"/>
-        </w:rPr>
-        <w:t>¿Existe sesgo?</w:t>
-      </w:r>
-    </w:p>
-    <w:p>
-      <w:pPr>
-        <w:rPr>
-          <w:rFonts w:ascii="Times New Roman" w:hAnsi="Times New Roman" w:cs="Times New Roman"/>
-        </w:rPr>
-      </w:pPr>
-      <w:r>
-        <w:rPr>
-          <w:rFonts w:ascii="Times New Roman" w:hAnsi="Times New Roman" w:cs="Times New Roman"/>
-        </w:rPr>
-        <w:t>CSI pretende responder una pregunta distinta:</w:t>
-      </w:r>
-    </w:p>
-    <w:p>
-      <w:pPr>
-        <w:rPr>
-          <w:rFonts w:ascii="Times New Roman" w:hAnsi="Times New Roman" w:cs="Times New Roman"/>
-        </w:rPr>
-      </w:pPr>
-      <w:r>
-        <w:rPr>
-          <w:rFonts w:ascii="Times New Roman" w:hAnsi="Times New Roman" w:cs="Times New Roman"/>
-        </w:rPr>
-        <w:t>"¿Está perdiendo capacidad de mantener diferencias semánticas significativas?"</w:t>
-      </w:r>
-    </w:p>
-    <w:p>
-      <w:pPr>
-        <w:rPr>
-          <w:rFonts w:ascii="Times New Roman" w:hAnsi="Times New Roman" w:cs="Times New Roman"/>
-        </w:rPr>
-      </w:pPr>
-      <w:r>
-        <w:rPr>
-          <w:rFonts w:ascii="Times New Roman" w:hAnsi="Times New Roman" w:cs="Times New Roman"/>
-        </w:rPr>
-        <w:t>En otras palabras:</w:t>
-      </w:r>
-    </w:p>
-    <w:p>
-      <w:pPr>
-        <w:rPr>
-          <w:rFonts w:ascii="Times New Roman" w:hAnsi="Times New Roman" w:cs="Times New Roman"/>
-        </w:rPr>
-      </w:pPr>
-      <w:r>
-        <w:rPr>
-          <w:rFonts w:ascii="Times New Roman" w:hAnsi="Times New Roman" w:cs="Times New Roman"/>
-        </w:rPr>
-        <w:t>CSI no mide únicamente sesgo.</w:t>
-      </w:r>
-    </w:p>
-    <w:p>
-      <w:pPr>
-        <w:rPr>
-          <w:rFonts w:ascii="Times New Roman" w:hAnsi="Times New Roman" w:cs="Times New Roman"/>
-        </w:rPr>
-      </w:pPr>
-      <w:r>
-        <w:rPr>
-          <w:rFonts w:ascii="Times New Roman" w:hAnsi="Times New Roman" w:cs="Times New Roman"/>
-        </w:rPr>
-        <w:t>CSI pretende medir la dinámica de convergencia semántica que puede dar lugar a la homogeneización progresiva de representaciones.</w:t>
-      </w:r>
-    </w:p>
-    <w:p>
-      <w:pPr>
-        <w:rPr>
-          <w:rFonts w:ascii="Times New Roman" w:hAnsi="Times New Roman" w:cs="Times New Roman"/>
-        </w:rPr>
-      </w:pPr>
-      <w:r>
-        <w:rPr>
-          <w:rFonts w:ascii="Times New Roman" w:hAnsi="Times New Roman" w:cs="Times New Roman"/>
-        </w:rPr>
-        <w:t>Conceptualmente, el foco del proyecto es el fenómeno denominado:</w:t>
-      </w:r>
-    </w:p>
-    <w:p>
-      <w:pPr>
-        <w:rPr>
-          <w:rFonts w:ascii="Times New Roman" w:hAnsi="Times New Roman" w:cs="Times New Roman"/>
-        </w:rPr>
-      </w:pPr>
-      <w:r>
-        <w:rPr>
-          <w:rFonts w:ascii="Times New Roman" w:hAnsi="Times New Roman" w:cs="Times New Roman"/>
-        </w:rPr>
-        <w:t>COLAPSO DE DISTINCIÓN</w:t>
-      </w:r>
-    </w:p>
-    <w:p>
-      <w:pPr>
-        <w:rPr>
-          <w:rFonts w:ascii="Times New Roman" w:hAnsi="Times New Roman" w:cs="Times New Roman"/>
-        </w:rPr>
-      </w:pPr>
-      <w:r>
-        <w:rPr>
-          <w:rFonts w:ascii="Times New Roman" w:hAnsi="Times New Roman" w:cs="Times New Roman"/>
-        </w:rPr>
-        <w:t>Definición provisional:</w:t>
-      </w:r>
-    </w:p>
-    <w:p>
-      <w:pPr>
-        <w:rPr>
-          <w:rFonts w:ascii="Times New Roman" w:hAnsi="Times New Roman" w:cs="Times New Roman"/>
-        </w:rPr>
-      </w:pPr>
-      <w:r>
-        <w:rPr>
-          <w:rFonts w:ascii="Times New Roman" w:hAnsi="Times New Roman" w:cs="Times New Roman"/>
-        </w:rPr>
-        <w:t>Proceso mediante el cual representaciones inicialmente diferenciadas convergen progresivamente hacia estados semánticos más uniformes.</w:t>
-      </w:r>
-    </w:p>
-    <w:p>
-      <w:pPr>
-        <w:rPr>
-          <w:rFonts w:ascii="Times New Roman" w:hAnsi="Times New Roman" w:cs="Times New Roman"/>
-          <w:b/>
-          <w:bCs/>
-        </w:rPr>
-      </w:pPr>
-      <w:r>
-        <w:rPr>
-          <w:rFonts w:ascii="Times New Roman" w:hAnsi="Times New Roman" w:cs="Times New Roman"/>
-          <w:b/>
-          <w:bCs/>
-        </w:rPr>
-        <w:t>======================================================================</w:t>
-      </w:r>
-      <w:r>
-        <w:rPr>
-          <w:rFonts w:ascii="Times New Roman" w:hAnsi="Times New Roman" w:cs="Times New Roman"/>
-          <w:b/>
-          <w:bCs/>
-        </w:rPr>
-        <w:br/>
-        <w:t>6. PRODUCTOS PREVISTOS</w:t>
-      </w:r>
-    </w:p>
-    <w:p>
-      <w:pPr>
-        <w:rPr>
-          <w:rFonts w:ascii="Times New Roman" w:hAnsi="Times New Roman" w:cs="Times New Roman"/>
-        </w:rPr>
-      </w:pPr>
-      <w:r>
-        <w:rPr>
-          <w:rFonts w:ascii="Times New Roman" w:hAnsi="Times New Roman" w:cs="Times New Roman"/>
-        </w:rPr>
-        <w:t>A) CSI Audit</w:t>
-      </w:r>
-    </w:p>
-    <w:p>
-      <w:pPr>
-        <w:rPr>
-          <w:rFonts w:ascii="Times New Roman" w:hAnsi="Times New Roman" w:cs="Times New Roman"/>
-        </w:rPr>
-      </w:pPr>
-      <w:r>
-        <w:rPr>
-          <w:rFonts w:ascii="Times New Roman" w:hAnsi="Times New Roman" w:cs="Times New Roman"/>
-        </w:rPr>
-        <w:t>Servicio profesional de auditoría.</w:t>
-      </w:r>
-    </w:p>
-    <w:p>
-      <w:pPr>
-        <w:rPr>
-          <w:rFonts w:ascii="Times New Roman" w:hAnsi="Times New Roman" w:cs="Times New Roman"/>
-        </w:rPr>
-      </w:pPr>
-      <w:r>
-        <w:rPr>
-          <w:rFonts w:ascii="Times New Roman" w:hAnsi="Times New Roman" w:cs="Times New Roman"/>
-        </w:rPr>
-        <w:t>Incluye:</w:t>
-      </w:r>
-    </w:p>
-    <w:p>
-      <w:pPr>
-        <w:numPr>
-          <w:ilvl w:val="0"/>
-          <w:numId w:val="6"/>
-        </w:numPr>
-        <w:rPr>
-          <w:rFonts w:ascii="Times New Roman" w:hAnsi="Times New Roman" w:cs="Times New Roman"/>
-        </w:rPr>
-      </w:pPr>
-      <w:r>
-        <w:rPr>
-          <w:rFonts w:ascii="Times New Roman" w:hAnsi="Times New Roman" w:cs="Times New Roman"/>
-        </w:rPr>
-        <w:t>Análisis de modelos.</w:t>
-      </w:r>
-    </w:p>
-    <w:p>
-      <w:pPr>
-        <w:numPr>
-          <w:ilvl w:val="0"/>
-          <w:numId w:val="6"/>
-        </w:numPr>
-        <w:rPr>
-          <w:rFonts w:ascii="Times New Roman" w:hAnsi="Times New Roman" w:cs="Times New Roman"/>
-        </w:rPr>
-      </w:pPr>
-      <w:r>
-        <w:rPr>
-          <w:rFonts w:ascii="Times New Roman" w:hAnsi="Times New Roman" w:cs="Times New Roman"/>
-        </w:rPr>
-        <w:t>Evaluación de convergencia semántica.</w:t>
-      </w:r>
-    </w:p>
-    <w:p>
-      <w:pPr>
-        <w:numPr>
-          <w:ilvl w:val="0"/>
-          <w:numId w:val="6"/>
-        </w:numPr>
-        <w:rPr>
-          <w:rFonts w:ascii="Times New Roman" w:hAnsi="Times New Roman" w:cs="Times New Roman"/>
-        </w:rPr>
-      </w:pPr>
-      <w:r>
-        <w:rPr>
-          <w:rFonts w:ascii="Times New Roman" w:hAnsi="Times New Roman" w:cs="Times New Roman"/>
-        </w:rPr>
-        <w:lastRenderedPageBreak/>
-        <w:t>Informes de riesgo.</w:t>
-      </w:r>
-    </w:p>
-    <w:p>
-      <w:pPr>
-        <w:numPr>
-          <w:ilvl w:val="0"/>
-          <w:numId w:val="6"/>
-        </w:numPr>
-        <w:rPr>
-          <w:rFonts w:ascii="Times New Roman" w:hAnsi="Times New Roman" w:cs="Times New Roman"/>
-        </w:rPr>
-      </w:pPr>
-      <w:r>
-        <w:rPr>
-          <w:rFonts w:ascii="Times New Roman" w:hAnsi="Times New Roman" w:cs="Times New Roman"/>
-        </w:rPr>
-        <w:t>Recomendaciones.</w:t>
-      </w:r>
-    </w:p>
-    <w:p>
-      <w:pPr>
-        <w:rPr>
-          <w:rFonts w:ascii="Times New Roman" w:hAnsi="Times New Roman" w:cs="Times New Roman"/>
-        </w:rPr>
-      </w:pPr>
-      <w:r>
-        <w:rPr>
-          <w:rFonts w:ascii="Times New Roman" w:hAnsi="Times New Roman" w:cs="Times New Roman"/>
-        </w:rPr>
-        <w:t xml:space="preserve">B) CSI </w:t>
-      </w:r>
-      <w:proofErr w:type="spellStart"/>
-      <w:r>
-        <w:rPr>
-          <w:rFonts w:ascii="Times New Roman" w:hAnsi="Times New Roman" w:cs="Times New Roman"/>
-        </w:rPr>
-        <w:t>Compliance</w:t>
-      </w:r>
-      <w:proofErr w:type="spellEnd"/>
-    </w:p>
-    <w:p>
-      <w:pPr>
-        <w:rPr>
-          <w:rFonts w:ascii="Times New Roman" w:hAnsi="Times New Roman" w:cs="Times New Roman"/>
-        </w:rPr>
-      </w:pPr>
-      <w:r>
-        <w:rPr>
-          <w:rFonts w:ascii="Times New Roman" w:hAnsi="Times New Roman" w:cs="Times New Roman"/>
-        </w:rPr>
-        <w:t>Herramienta orientada a gobernanza y cumplimiento normativo.</w:t>
-      </w:r>
-    </w:p>
-    <w:p>
-      <w:pPr>
-        <w:rPr>
-          <w:rFonts w:ascii="Times New Roman" w:hAnsi="Times New Roman" w:cs="Times New Roman"/>
-        </w:rPr>
-      </w:pPr>
-      <w:r>
-        <w:rPr>
-          <w:rFonts w:ascii="Times New Roman" w:hAnsi="Times New Roman" w:cs="Times New Roman"/>
-        </w:rPr>
-        <w:t>C) CSI Monitor</w:t>
-      </w:r>
-    </w:p>
-    <w:p>
-      <w:pPr>
-        <w:rPr>
-          <w:rFonts w:ascii="Times New Roman" w:hAnsi="Times New Roman" w:cs="Times New Roman"/>
-        </w:rPr>
-      </w:pPr>
-      <w:r>
-        <w:rPr>
-          <w:rFonts w:ascii="Times New Roman" w:hAnsi="Times New Roman" w:cs="Times New Roman"/>
-        </w:rPr>
-        <w:t>Sistema de monitorización continua.</w:t>
-      </w:r>
-    </w:p>
-    <w:p>
-      <w:pPr>
-        <w:rPr>
-          <w:rFonts w:ascii="Times New Roman" w:hAnsi="Times New Roman" w:cs="Times New Roman"/>
-        </w:rPr>
-      </w:pPr>
-      <w:r>
-        <w:rPr>
-          <w:rFonts w:ascii="Times New Roman" w:hAnsi="Times New Roman" w:cs="Times New Roman"/>
-        </w:rPr>
-        <w:t>D) CSI API</w:t>
-      </w:r>
-    </w:p>
-    <w:p>
-      <w:pPr>
-        <w:rPr>
-          <w:rFonts w:ascii="Times New Roman" w:hAnsi="Times New Roman" w:cs="Times New Roman"/>
-        </w:rPr>
-      </w:pPr>
-      <w:r>
-        <w:rPr>
-          <w:rFonts w:ascii="Times New Roman" w:hAnsi="Times New Roman" w:cs="Times New Roman"/>
-        </w:rPr>
-        <w:t>Integración con aplicaciones de terceros.</w:t>
-      </w:r>
-    </w:p>
-    <w:p>
-      <w:pPr>
-        <w:rPr>
-          <w:rFonts w:ascii="Times New Roman" w:hAnsi="Times New Roman" w:cs="Times New Roman"/>
-        </w:rPr>
-      </w:pPr>
-      <w:r>
-        <w:rPr>
-          <w:rFonts w:ascii="Times New Roman" w:hAnsi="Times New Roman" w:cs="Times New Roman"/>
-        </w:rPr>
-        <w:t xml:space="preserve">E) CSI </w:t>
-      </w:r>
-      <w:proofErr w:type="spellStart"/>
-      <w:r>
-        <w:rPr>
-          <w:rFonts w:ascii="Times New Roman" w:hAnsi="Times New Roman" w:cs="Times New Roman"/>
-        </w:rPr>
-        <w:t>Research</w:t>
-      </w:r>
-      <w:proofErr w:type="spellEnd"/>
-    </w:p>
-    <w:p>
-      <w:pPr>
-        <w:rPr>
-          <w:rFonts w:ascii="Times New Roman" w:hAnsi="Times New Roman" w:cs="Times New Roman"/>
-        </w:rPr>
-      </w:pPr>
-      <w:r>
-        <w:rPr>
-          <w:rFonts w:ascii="Times New Roman" w:hAnsi="Times New Roman" w:cs="Times New Roman"/>
-        </w:rPr>
-        <w:t>Licencias académicas y de investigación.</w:t>
-      </w:r>
-    </w:p>
-    <w:p>
-      <w:pPr>
-        <w:rPr>
-          <w:rFonts w:ascii="Times New Roman" w:hAnsi="Times New Roman" w:cs="Times New Roman"/>
-          <w:b/>
-          <w:bCs/>
-        </w:rPr>
-      </w:pPr>
-      <w:r>
-        <w:rPr>
-          <w:rFonts w:ascii="Times New Roman" w:hAnsi="Times New Roman" w:cs="Times New Roman"/>
-          <w:b/>
-          <w:bCs/>
-        </w:rPr>
-        <w:t>======================================================================</w:t>
-      </w:r>
-      <w:r>
-        <w:rPr>
-          <w:rFonts w:ascii="Times New Roman" w:hAnsi="Times New Roman" w:cs="Times New Roman"/>
-          <w:b/>
-          <w:bCs/>
-        </w:rPr>
-        <w:br/>
-        <w:t>7. CLIENTES OBJETIVO</w:t>
-      </w:r>
-    </w:p>
-    <w:p>
-      <w:pPr>
-        <w:rPr>
-          <w:rFonts w:ascii="Times New Roman" w:hAnsi="Times New Roman" w:cs="Times New Roman"/>
-        </w:rPr>
-      </w:pPr>
-      <w:r>
-        <w:rPr>
-          <w:rFonts w:ascii="Times New Roman" w:hAnsi="Times New Roman" w:cs="Times New Roman"/>
-        </w:rPr>
-        <w:t>Fase inicial:</w:t>
-      </w:r>
-    </w:p>
-    <w:p>
-      <w:pPr>
-        <w:numPr>
-          <w:ilvl w:val="0"/>
-          <w:numId w:val="7"/>
-        </w:numPr>
-        <w:rPr>
-          <w:rFonts w:ascii="Times New Roman" w:hAnsi="Times New Roman" w:cs="Times New Roman"/>
-        </w:rPr>
-      </w:pPr>
-      <w:r>
-        <w:rPr>
-          <w:rFonts w:ascii="Times New Roman" w:hAnsi="Times New Roman" w:cs="Times New Roman"/>
-        </w:rPr>
-        <w:t>Consultoras tecnológicas.</w:t>
-      </w:r>
-    </w:p>
-    <w:p>
-      <w:pPr>
-        <w:numPr>
-          <w:ilvl w:val="0"/>
-          <w:numId w:val="7"/>
-        </w:numPr>
-        <w:rPr>
-          <w:rFonts w:ascii="Times New Roman" w:hAnsi="Times New Roman" w:cs="Times New Roman"/>
-        </w:rPr>
-      </w:pPr>
-      <w:r>
-        <w:rPr>
-          <w:rFonts w:ascii="Times New Roman" w:hAnsi="Times New Roman" w:cs="Times New Roman"/>
-        </w:rPr>
-        <w:t>Consultoras de auditoría.</w:t>
-      </w:r>
-    </w:p>
-    <w:p>
-      <w:pPr>
-        <w:numPr>
-          <w:ilvl w:val="0"/>
-          <w:numId w:val="7"/>
-        </w:numPr>
-        <w:rPr>
-          <w:rFonts w:ascii="Times New Roman" w:hAnsi="Times New Roman" w:cs="Times New Roman"/>
-        </w:rPr>
-      </w:pPr>
-      <w:r>
-        <w:rPr>
-          <w:rFonts w:ascii="Times New Roman" w:hAnsi="Times New Roman" w:cs="Times New Roman"/>
-        </w:rPr>
-        <w:t>Consultoras de cumplimiento normativo.</w:t>
-      </w:r>
-    </w:p>
-    <w:p>
-      <w:pPr>
-        <w:rPr>
-          <w:rFonts w:ascii="Times New Roman" w:hAnsi="Times New Roman" w:cs="Times New Roman"/>
-        </w:rPr>
-      </w:pPr>
-      <w:r>
-        <w:rPr>
-          <w:rFonts w:ascii="Times New Roman" w:hAnsi="Times New Roman" w:cs="Times New Roman"/>
-        </w:rPr>
-        <w:t>Fase intermedia:</w:t>
-      </w:r>
-    </w:p>
-    <w:p>
-      <w:pPr>
-        <w:numPr>
-          <w:ilvl w:val="0"/>
-          <w:numId w:val="8"/>
-        </w:numPr>
-        <w:rPr>
-          <w:rFonts w:ascii="Times New Roman" w:hAnsi="Times New Roman" w:cs="Times New Roman"/>
-        </w:rPr>
-      </w:pPr>
-      <w:r>
-        <w:rPr>
-          <w:rFonts w:ascii="Times New Roman" w:hAnsi="Times New Roman" w:cs="Times New Roman"/>
-        </w:rPr>
-        <w:t>Grandes empresas que utilizan IA.</w:t>
-      </w:r>
-    </w:p>
-    <w:p>
-      <w:pPr>
-        <w:numPr>
-          <w:ilvl w:val="0"/>
-          <w:numId w:val="8"/>
-        </w:numPr>
-        <w:rPr>
-          <w:rFonts w:ascii="Times New Roman" w:hAnsi="Times New Roman" w:cs="Times New Roman"/>
-        </w:rPr>
-      </w:pPr>
-      <w:r>
-        <w:rPr>
-          <w:rFonts w:ascii="Times New Roman" w:hAnsi="Times New Roman" w:cs="Times New Roman"/>
-        </w:rPr>
-        <w:t>Organizaciones con modelos propios.</w:t>
-      </w:r>
-    </w:p>
-    <w:p>
-      <w:pPr>
-        <w:rPr>
-          <w:rFonts w:ascii="Times New Roman" w:hAnsi="Times New Roman" w:cs="Times New Roman"/>
-        </w:rPr>
-      </w:pPr>
-      <w:r>
-        <w:rPr>
-          <w:rFonts w:ascii="Times New Roman" w:hAnsi="Times New Roman" w:cs="Times New Roman"/>
-        </w:rPr>
-        <w:t>Fase avanzada:</w:t>
-      </w:r>
-    </w:p>
-    <w:p>
-      <w:pPr>
-        <w:numPr>
-          <w:ilvl w:val="0"/>
-          <w:numId w:val="9"/>
-        </w:numPr>
-        <w:rPr>
-          <w:rFonts w:ascii="Times New Roman" w:hAnsi="Times New Roman" w:cs="Times New Roman"/>
-        </w:rPr>
-      </w:pPr>
-      <w:r>
-        <w:rPr>
-          <w:rFonts w:ascii="Times New Roman" w:hAnsi="Times New Roman" w:cs="Times New Roman"/>
-        </w:rPr>
-        <w:t>Administraciones públicas.</w:t>
-      </w:r>
-    </w:p>
-    <w:p>
-      <w:pPr>
-        <w:numPr>
-          <w:ilvl w:val="0"/>
-          <w:numId w:val="9"/>
-        </w:numPr>
-        <w:rPr>
-          <w:rFonts w:ascii="Times New Roman" w:hAnsi="Times New Roman" w:cs="Times New Roman"/>
-        </w:rPr>
-      </w:pPr>
-      <w:r>
-        <w:rPr>
-          <w:rFonts w:ascii="Times New Roman" w:hAnsi="Times New Roman" w:cs="Times New Roman"/>
-        </w:rPr>
-        <w:t>Organismos reguladores.</w:t>
-      </w:r>
-    </w:p>
-    <w:p>
-      <w:pPr>
-        <w:numPr>
-          <w:ilvl w:val="0"/>
-          <w:numId w:val="9"/>
-        </w:numPr>
-        <w:rPr>
-          <w:rFonts w:ascii="Times New Roman" w:hAnsi="Times New Roman" w:cs="Times New Roman"/>
-        </w:rPr>
-      </w:pPr>
-      <w:r>
-        <w:rPr>
-          <w:rFonts w:ascii="Times New Roman" w:hAnsi="Times New Roman" w:cs="Times New Roman"/>
-        </w:rPr>
-        <w:t>Centros de investigación.</w:t>
-      </w:r>
-    </w:p>
-    <w:p>
-      <w:pPr>
-        <w:rPr>
-          <w:rFonts w:ascii="Times New Roman" w:hAnsi="Times New Roman" w:cs="Times New Roman"/>
-          <w:b/>
-          <w:bCs/>
-        </w:rPr>
-      </w:pPr>
-      <w:r>
-        <w:rPr>
-          <w:rFonts w:ascii="Times New Roman" w:hAnsi="Times New Roman" w:cs="Times New Roman"/>
-          <w:b/>
-          <w:bCs/>
-        </w:rPr>
-        <w:t>======================================================================</w:t>
-      </w:r>
-      <w:r>
-        <w:rPr>
-          <w:rFonts w:ascii="Times New Roman" w:hAnsi="Times New Roman" w:cs="Times New Roman"/>
           <w:b/>
           <w:bCs/>
         </w:rPr>
@@ -1552,173 +879,74 @@
       </w:r>
     </w:p>
     <w:p>
+      <w:r>
+        <w:t>Fase 1</w:t>
+      </w:r>
+    </w:p>
+    <w:p>
+      <w:r>
+        <w:t>Servicios de auditoría.</w:t>
+      </w:r>
+    </w:p>
+    <w:p>
+      <w:r>
+        <w:t>Fase 2</w:t>
+      </w:r>
+    </w:p>
+    <w:p>
+      <w:r>
+        <w:t>Licencias metodológicas.</w:t>
+      </w:r>
+    </w:p>
+    <w:p>
+      <w:r>
+        <w:t>Fase 3</w:t>
+      </w:r>
+    </w:p>
+    <w:p>
+      <w:r>
+        <w:t>Formación especializada.</w:t>
+      </w:r>
+    </w:p>
+    <w:p>
+      <w:r>
+        <w:t>Fase 4</w:t>
+      </w:r>
+    </w:p>
+    <w:p>
+      <w:r>
+        <w:t>Software SaaS.</w:t>
+      </w:r>
+    </w:p>
+    <w:p>
+      <w:r>
+        <w:t>Fase 5</w:t>
+      </w:r>
+    </w:p>
+    <w:p>
+      <w:r>
+        <w:t>API empresarial.</w:t>
+      </w:r>
+    </w:p>
+    <w:p>
+      <w:r>
+        <w:t>Fase 6</w:t>
+      </w:r>
+    </w:p>
+    <w:p>
+      <w:r>
+        <w:t>Licenciamiento internacional de tecnología.</w:t>
+      </w:r>
+    </w:p>
+    <w:p>
       <w:pPr>
         <w:rPr>
-          <w:rFonts w:ascii="Times New Roman" w:hAnsi="Times New Roman" w:cs="Times New Roman"/>
-        </w:rPr>
-      </w:pPr>
-      <w:r>
-        <w:rPr>
-          <w:rFonts w:ascii="Times New Roman" w:hAnsi="Times New Roman" w:cs="Times New Roman"/>
-        </w:rPr>
-        <w:t>Fase 1</w:t>
-      </w:r>
-    </w:p>
-    <w:p>
-      <w:pPr>
-        <w:rPr>
-          <w:rFonts w:ascii="Times New Roman" w:hAnsi="Times New Roman" w:cs="Times New Roman"/>
-        </w:rPr>
-      </w:pPr>
-      <w:r>
-        <w:rPr>
-          <w:rFonts w:ascii="Times New Roman" w:hAnsi="Times New Roman" w:cs="Times New Roman"/>
-        </w:rPr>
-        <w:t>Servicios de auditoría.</w:t>
-      </w:r>
-    </w:p>
-    <w:p>
-      <w:pPr>
-        <w:rPr>
-          <w:rFonts w:ascii="Times New Roman" w:hAnsi="Times New Roman" w:cs="Times New Roman"/>
-        </w:rPr>
-      </w:pPr>
-      <w:r>
-        <w:rPr>
-          <w:rFonts w:ascii="Times New Roman" w:hAnsi="Times New Roman" w:cs="Times New Roman"/>
-        </w:rPr>
-        <w:t>Fase 2</w:t>
-      </w:r>
-    </w:p>
-    <w:p>
-      <w:pPr>
-        <w:rPr>
-          <w:rFonts w:ascii="Times New Roman" w:hAnsi="Times New Roman" w:cs="Times New Roman"/>
-        </w:rPr>
-      </w:pPr>
-      <w:r>
-        <w:rPr>
-          <w:rFonts w:ascii="Times New Roman" w:hAnsi="Times New Roman" w:cs="Times New Roman"/>
-        </w:rPr>
-        <w:lastRenderedPageBreak/>
-        <w:t>Licencias metodológicas.</w:t>
-      </w:r>
-    </w:p>
-    <w:p>
-      <w:pPr>
-        <w:rPr>
-          <w:rFonts w:ascii="Times New Roman" w:hAnsi="Times New Roman" w:cs="Times New Roman"/>
-        </w:rPr>
-      </w:pPr>
-      <w:r>
-        <w:rPr>
-          <w:rFonts w:ascii="Times New Roman" w:hAnsi="Times New Roman" w:cs="Times New Roman"/>
-        </w:rPr>
-        <w:t>Fase 3</w:t>
-      </w:r>
-    </w:p>
-    <w:p>
-      <w:pPr>
-        <w:rPr>
-          <w:rFonts w:ascii="Times New Roman" w:hAnsi="Times New Roman" w:cs="Times New Roman"/>
-        </w:rPr>
-      </w:pPr>
-      <w:r>
-        <w:rPr>
-          <w:rFonts w:ascii="Times New Roman" w:hAnsi="Times New Roman" w:cs="Times New Roman"/>
-        </w:rPr>
-        <w:t>Formación especializada.</w:t>
-      </w:r>
-    </w:p>
-    <w:p>
-      <w:pPr>
-        <w:rPr>
-          <w:rFonts w:ascii="Times New Roman" w:hAnsi="Times New Roman" w:cs="Times New Roman"/>
-        </w:rPr>
-      </w:pPr>
-      <w:r>
-        <w:rPr>
-          <w:rFonts w:ascii="Times New Roman" w:hAnsi="Times New Roman" w:cs="Times New Roman"/>
-        </w:rPr>
-        <w:t>Fase 4</w:t>
-      </w:r>
-    </w:p>
-    <w:p>
-      <w:pPr>
-        <w:rPr>
-          <w:rFonts w:ascii="Times New Roman" w:hAnsi="Times New Roman" w:cs="Times New Roman"/>
-        </w:rPr>
-      </w:pPr>
-      <w:r>
-        <w:rPr>
-          <w:rFonts w:ascii="Times New Roman" w:hAnsi="Times New Roman" w:cs="Times New Roman"/>
-        </w:rPr>
-        <w:t>Software SaaS.</w:t>
-      </w:r>
-    </w:p>
-    <w:p>
-      <w:pPr>
-        <w:rPr>
-          <w:rFonts w:ascii="Times New Roman" w:hAnsi="Times New Roman" w:cs="Times New Roman"/>
-        </w:rPr>
-      </w:pPr>
-      <w:r>
-        <w:rPr>
-          <w:rFonts w:ascii="Times New Roman" w:hAnsi="Times New Roman" w:cs="Times New Roman"/>
-        </w:rPr>
-        <w:t>Fase 5</w:t>
-      </w:r>
-    </w:p>
-    <w:p>
-      <w:pPr>
-        <w:rPr>
-          <w:rFonts w:ascii="Times New Roman" w:hAnsi="Times New Roman" w:cs="Times New Roman"/>
-        </w:rPr>
-      </w:pPr>
-      <w:r>
-        <w:rPr>
-          <w:rFonts w:ascii="Times New Roman" w:hAnsi="Times New Roman" w:cs="Times New Roman"/>
-        </w:rPr>
-        <w:t>API empresarial.</w:t>
-      </w:r>
-    </w:p>
-    <w:p>
-      <w:pPr>
-        <w:rPr>
-          <w:rFonts w:ascii="Times New Roman" w:hAnsi="Times New Roman" w:cs="Times New Roman"/>
-        </w:rPr>
-      </w:pPr>
-      <w:r>
-        <w:rPr>
-          <w:rFonts w:ascii="Times New Roman" w:hAnsi="Times New Roman" w:cs="Times New Roman"/>
-        </w:rPr>
-        <w:t>Fase 6</w:t>
-      </w:r>
-    </w:p>
-    <w:p>
-      <w:pPr>
-        <w:rPr>
-          <w:rFonts w:ascii="Times New Roman" w:hAnsi="Times New Roman" w:cs="Times New Roman"/>
-        </w:rPr>
-      </w:pPr>
-      <w:r>
-        <w:rPr>
-          <w:rFonts w:ascii="Times New Roman" w:hAnsi="Times New Roman" w:cs="Times New Roman"/>
-        </w:rPr>
-        <w:t>Licenciamiento internacional de tecnología.</w:t>
-      </w:r>
-    </w:p>
-    <w:p>
-      <w:pPr>
-        <w:rPr>
-          <w:rFonts w:ascii="Times New Roman" w:hAnsi="Times New Roman" w:cs="Times New Roman"/>
           <w:b/>
           <w:bCs/>
         </w:rPr>
       </w:pPr>
       <w:r>
         <w:rPr>
-          <w:rFonts w:ascii="Times New Roman" w:hAnsi="Times New Roman" w:cs="Times New Roman"/>
           <w:b/>
           <w:bCs/>
         </w:rPr>
@@ -1726,7 +954,6 @@
       </w:r>
       <w:r>
         <w:rPr>
-          <w:rFonts w:ascii="Times New Roman" w:hAnsi="Times New Roman" w:cs="Times New Roman"/>
           <w:b/>
           <w:bCs/>
         </w:rPr>
@@ -1735,212 +962,135 @@
       </w:r>
     </w:p>
     <w:p>
+      <w:r>
+        <w:t>Fundador principal</w:t>
+      </w:r>
+    </w:p>
+    <w:p>
+      <w:pPr>
+        <w:numPr>
+          <w:ilvl w:val="0"/>
+          <w:numId w:val="10"/>
+        </w:numPr>
+      </w:pPr>
+      <w:r>
+        <w:t>Autor del marco conceptual.</w:t>
+      </w:r>
+    </w:p>
+    <w:p>
+      <w:pPr>
+        <w:numPr>
+          <w:ilvl w:val="0"/>
+          <w:numId w:val="10"/>
+        </w:numPr>
+      </w:pPr>
+      <w:r>
+        <w:t>Estrategia.</w:t>
+      </w:r>
+    </w:p>
+    <w:p>
+      <w:pPr>
+        <w:numPr>
+          <w:ilvl w:val="0"/>
+          <w:numId w:val="10"/>
+        </w:numPr>
+      </w:pPr>
+      <w:r>
+        <w:t>Propiedad intelectual.</w:t>
+      </w:r>
+    </w:p>
+    <w:p>
+      <w:pPr>
+        <w:numPr>
+          <w:ilvl w:val="0"/>
+          <w:numId w:val="10"/>
+        </w:numPr>
+      </w:pPr>
+      <w:r>
+        <w:t>Licenciamiento.</w:t>
+      </w:r>
+    </w:p>
+    <w:p>
+      <w:pPr>
+        <w:numPr>
+          <w:ilvl w:val="0"/>
+          <w:numId w:val="10"/>
+        </w:numPr>
+      </w:pPr>
+      <w:r>
+        <w:t>Relaciones institucionales.</w:t>
+      </w:r>
+    </w:p>
+    <w:p>
+      <w:r>
+        <w:t>Socio técnico</w:t>
+      </w:r>
+    </w:p>
+    <w:p>
+      <w:pPr>
+        <w:numPr>
+          <w:ilvl w:val="0"/>
+          <w:numId w:val="11"/>
+        </w:numPr>
+      </w:pPr>
+      <w:r>
+        <w:t>Desarrollo tecnológico.</w:t>
+      </w:r>
+    </w:p>
+    <w:p>
+      <w:pPr>
+        <w:numPr>
+          <w:ilvl w:val="0"/>
+          <w:numId w:val="11"/>
+        </w:numPr>
+      </w:pPr>
+      <w:r>
+        <w:t>Infraestructura.</w:t>
+      </w:r>
+    </w:p>
+    <w:p>
+      <w:pPr>
+        <w:numPr>
+          <w:ilvl w:val="0"/>
+          <w:numId w:val="11"/>
+        </w:numPr>
+      </w:pPr>
+      <w:r>
+        <w:t>Automatización.</w:t>
+      </w:r>
+    </w:p>
+    <w:p>
+      <w:pPr>
+        <w:numPr>
+          <w:ilvl w:val="0"/>
+          <w:numId w:val="11"/>
+        </w:numPr>
+      </w:pPr>
+      <w:r>
+        <w:t>Arquitectura.</w:t>
+      </w:r>
+    </w:p>
+    <w:p>
+      <w:pPr>
+        <w:numPr>
+          <w:ilvl w:val="0"/>
+          <w:numId w:val="11"/>
+        </w:numPr>
+      </w:pPr>
+      <w:r>
+        <w:lastRenderedPageBreak/>
+        <w:t>Producto.</w:t>
+      </w:r>
+    </w:p>
+    <w:p>
       <w:pPr>
         <w:rPr>
-          <w:rFonts w:ascii="Times New Roman" w:hAnsi="Times New Roman" w:cs="Times New Roman"/>
-        </w:rPr>
-      </w:pPr>
-      <w:r>
-        <w:rPr>
-          <w:rFonts w:ascii="Times New Roman" w:hAnsi="Times New Roman" w:cs="Times New Roman"/>
-        </w:rPr>
-        <w:t>Fundador principal</w:t>
-      </w:r>
-    </w:p>
-    <w:p>
-      <w:pPr>
-        <w:numPr>
-          <w:ilvl w:val="0"/>
-          <w:numId w:val="10"/>
-        </w:numPr>
-        <w:rPr>
-          <w:rFonts w:ascii="Times New Roman" w:hAnsi="Times New Roman" w:cs="Times New Roman"/>
-        </w:rPr>
-      </w:pPr>
-      <w:r>
-        <w:rPr>
-          <w:rFonts w:ascii="Times New Roman" w:hAnsi="Times New Roman" w:cs="Times New Roman"/>
-        </w:rPr>
-        <w:t>Autor del marco conceptual.</w:t>
-      </w:r>
-    </w:p>
-    <w:p>
-      <w:pPr>
-        <w:numPr>
-          <w:ilvl w:val="0"/>
-          <w:numId w:val="10"/>
-        </w:numPr>
-        <w:rPr>
-          <w:rFonts w:ascii="Times New Roman" w:hAnsi="Times New Roman" w:cs="Times New Roman"/>
-        </w:rPr>
-      </w:pPr>
-      <w:r>
-        <w:rPr>
-          <w:rFonts w:ascii="Times New Roman" w:hAnsi="Times New Roman" w:cs="Times New Roman"/>
-        </w:rPr>
-        <w:t>Estrategia.</w:t>
-      </w:r>
-    </w:p>
-    <w:p>
-      <w:pPr>
-        <w:numPr>
-          <w:ilvl w:val="0"/>
-          <w:numId w:val="10"/>
-        </w:numPr>
-        <w:rPr>
-          <w:rFonts w:ascii="Times New Roman" w:hAnsi="Times New Roman" w:cs="Times New Roman"/>
-        </w:rPr>
-      </w:pPr>
-      <w:r>
-        <w:rPr>
-          <w:rFonts w:ascii="Times New Roman" w:hAnsi="Times New Roman" w:cs="Times New Roman"/>
-        </w:rPr>
-        <w:t>Propiedad intelectual.</w:t>
-      </w:r>
-    </w:p>
-    <w:p>
-      <w:pPr>
-        <w:numPr>
-          <w:ilvl w:val="0"/>
-          <w:numId w:val="10"/>
-        </w:numPr>
-        <w:rPr>
-          <w:rFonts w:ascii="Times New Roman" w:hAnsi="Times New Roman" w:cs="Times New Roman"/>
-        </w:rPr>
-      </w:pPr>
-      <w:r>
-        <w:rPr>
-          <w:rFonts w:ascii="Times New Roman" w:hAnsi="Times New Roman" w:cs="Times New Roman"/>
-        </w:rPr>
-        <w:t>Licenciamiento.</w:t>
-      </w:r>
-    </w:p>
-    <w:p>
-      <w:pPr>
-        <w:numPr>
-          <w:ilvl w:val="0"/>
-          <w:numId w:val="10"/>
-        </w:numPr>
-        <w:rPr>
-          <w:rFonts w:ascii="Times New Roman" w:hAnsi="Times New Roman" w:cs="Times New Roman"/>
-        </w:rPr>
-      </w:pPr>
-      <w:r>
-        <w:rPr>
-          <w:rFonts w:ascii="Times New Roman" w:hAnsi="Times New Roman" w:cs="Times New Roman"/>
-        </w:rPr>
-        <w:t>Relaciones institucionales.</w:t>
-      </w:r>
-    </w:p>
-    <w:p>
-      <w:pPr>
-        <w:rPr>
-          <w:rFonts w:ascii="Times New Roman" w:hAnsi="Times New Roman" w:cs="Times New Roman"/>
-        </w:rPr>
-      </w:pPr>
-      <w:r>
-        <w:rPr>
-          <w:rFonts w:ascii="Times New Roman" w:hAnsi="Times New Roman" w:cs="Times New Roman"/>
-        </w:rPr>
-        <w:t>Socio técnico</w:t>
-      </w:r>
-    </w:p>
-    <w:p>
-      <w:pPr>
-        <w:numPr>
-          <w:ilvl w:val="0"/>
-          <w:numId w:val="11"/>
-        </w:numPr>
-        <w:rPr>
-          <w:rFonts w:ascii="Times New Roman" w:hAnsi="Times New Roman" w:cs="Times New Roman"/>
-        </w:rPr>
-      </w:pPr>
-      <w:r>
-        <w:rPr>
-          <w:rFonts w:ascii="Times New Roman" w:hAnsi="Times New Roman" w:cs="Times New Roman"/>
-        </w:rPr>
-        <w:t>Desarrollo tecnológico.</w:t>
-      </w:r>
-    </w:p>
-    <w:p>
-      <w:pPr>
-        <w:numPr>
-          <w:ilvl w:val="0"/>
-          <w:numId w:val="11"/>
-        </w:numPr>
-        <w:rPr>
-          <w:rFonts w:ascii="Times New Roman" w:hAnsi="Times New Roman" w:cs="Times New Roman"/>
-        </w:rPr>
-      </w:pPr>
-      <w:r>
-        <w:rPr>
-          <w:rFonts w:ascii="Times New Roman" w:hAnsi="Times New Roman" w:cs="Times New Roman"/>
-        </w:rPr>
-        <w:t>Infraestructura.</w:t>
-      </w:r>
-    </w:p>
-    <w:p>
-      <w:pPr>
-        <w:numPr>
-          <w:ilvl w:val="0"/>
-          <w:numId w:val="11"/>
-        </w:numPr>
-        <w:rPr>
-          <w:rFonts w:ascii="Times New Roman" w:hAnsi="Times New Roman" w:cs="Times New Roman"/>
-        </w:rPr>
-      </w:pPr>
-      <w:r>
-        <w:rPr>
-          <w:rFonts w:ascii="Times New Roman" w:hAnsi="Times New Roman" w:cs="Times New Roman"/>
-        </w:rPr>
-        <w:t>Automatización.</w:t>
-      </w:r>
-    </w:p>
-    <w:p>
-      <w:pPr>
-        <w:numPr>
-          <w:ilvl w:val="0"/>
-          <w:numId w:val="11"/>
-        </w:numPr>
-        <w:rPr>
-          <w:rFonts w:ascii="Times New Roman" w:hAnsi="Times New Roman" w:cs="Times New Roman"/>
-        </w:rPr>
-      </w:pPr>
-      <w:r>
-        <w:rPr>
-          <w:rFonts w:ascii="Times New Roman" w:hAnsi="Times New Roman" w:cs="Times New Roman"/>
-        </w:rPr>
-        <w:t>Arquitectura.</w:t>
-      </w:r>
-    </w:p>
-    <w:p>
-      <w:pPr>
-        <w:numPr>
-          <w:ilvl w:val="0"/>
-          <w:numId w:val="11"/>
-        </w:numPr>
-        <w:rPr>
-          <w:rFonts w:ascii="Times New Roman" w:hAnsi="Times New Roman" w:cs="Times New Roman"/>
-        </w:rPr>
-      </w:pPr>
-      <w:r>
-        <w:rPr>
-          <w:rFonts w:ascii="Times New Roman" w:hAnsi="Times New Roman" w:cs="Times New Roman"/>
-        </w:rPr>
-        <w:t>Producto.</w:t>
-      </w:r>
-    </w:p>
-    <w:p>
-      <w:pPr>
-        <w:rPr>
-          <w:rFonts w:ascii="Times New Roman" w:hAnsi="Times New Roman" w:cs="Times New Roman"/>
           <w:b/>
           <w:bCs/>
         </w:rPr>
       </w:pPr>
       <w:r>
         <w:rPr>
-          <w:rFonts w:ascii="Times New Roman" w:hAnsi="Times New Roman" w:cs="Times New Roman"/>
           <w:b/>
           <w:bCs/>
         </w:rPr>
@@ -1948,7 +1098,6 @@
       </w:r>
       <w:r>
         <w:rPr>
-          <w:rFonts w:ascii="Times New Roman" w:hAnsi="Times New Roman" w:cs="Times New Roman"/>
           <w:b/>
           <w:bCs/>
         </w:rPr>
@@ -1957,115 +1106,74 @@
       </w:r>
     </w:p>
     <w:p>
+      <w:r>
+        <w:t>La propuesta presenta potencial de transferencia tecnológica mediante:</w:t>
+      </w:r>
+    </w:p>
+    <w:p>
+      <w:pPr>
+        <w:numPr>
+          <w:ilvl w:val="0"/>
+          <w:numId w:val="12"/>
+        </w:numPr>
+      </w:pPr>
+      <w:r>
+        <w:t>Desarrollo de metodología propia.</w:t>
+      </w:r>
+    </w:p>
+    <w:p>
+      <w:pPr>
+        <w:numPr>
+          <w:ilvl w:val="0"/>
+          <w:numId w:val="12"/>
+        </w:numPr>
+      </w:pPr>
+      <w:r>
+        <w:t>Creación de herramientas software.</w:t>
+      </w:r>
+    </w:p>
+    <w:p>
+      <w:pPr>
+        <w:numPr>
+          <w:ilvl w:val="0"/>
+          <w:numId w:val="12"/>
+        </w:numPr>
+      </w:pPr>
+      <w:r>
+        <w:t>Explotación de know-how.</w:t>
+      </w:r>
+    </w:p>
+    <w:p>
+      <w:pPr>
+        <w:numPr>
+          <w:ilvl w:val="0"/>
+          <w:numId w:val="12"/>
+        </w:numPr>
+      </w:pPr>
+      <w:r>
+        <w:t>Prestación de servicios especializados.</w:t>
+      </w:r>
+    </w:p>
+    <w:p>
+      <w:pPr>
+        <w:numPr>
+          <w:ilvl w:val="0"/>
+          <w:numId w:val="12"/>
+        </w:numPr>
+      </w:pPr>
+      <w:r>
+        <w:t>Posible constitución de Empresa de Base Tecnológica.</w:t>
+      </w:r>
+    </w:p>
+    <w:p>
       <w:pPr>
         <w:rPr>
-          <w:rFonts w:ascii="Times New Roman" w:hAnsi="Times New Roman" w:cs="Times New Roman"/>
-        </w:rPr>
-      </w:pPr>
-      <w:r>
-        <w:rPr>
-          <w:rFonts w:ascii="Times New Roman" w:hAnsi="Times New Roman" w:cs="Times New Roman"/>
-        </w:rPr>
-        <w:t>La propuesta presenta potencial de transferencia tecnológica mediante:</w:t>
-      </w:r>
-    </w:p>
-    <w:p>
-      <w:pPr>
-        <w:numPr>
-          <w:ilvl w:val="0"/>
-          <w:numId w:val="12"/>
-        </w:numPr>
-        <w:rPr>
-          <w:rFonts w:ascii="Times New Roman" w:hAnsi="Times New Roman" w:cs="Times New Roman"/>
-        </w:rPr>
-      </w:pPr>
-      <w:r>
-        <w:rPr>
-          <w:rFonts w:ascii="Times New Roman" w:hAnsi="Times New Roman" w:cs="Times New Roman"/>
-        </w:rPr>
-        <w:t>Desarrollo de metodología propia.</w:t>
-      </w:r>
-    </w:p>
-    <w:p>
-      <w:pPr>
-        <w:numPr>
-          <w:ilvl w:val="0"/>
-          <w:numId w:val="12"/>
-        </w:numPr>
-        <w:rPr>
-          <w:rFonts w:ascii="Times New Roman" w:hAnsi="Times New Roman" w:cs="Times New Roman"/>
-        </w:rPr>
-      </w:pPr>
-      <w:r>
-        <w:rPr>
-          <w:rFonts w:ascii="Times New Roman" w:hAnsi="Times New Roman" w:cs="Times New Roman"/>
-        </w:rPr>
-        <w:t>Creación de herramientas software.</w:t>
-      </w:r>
-    </w:p>
-    <w:p>
-      <w:pPr>
-        <w:numPr>
-          <w:ilvl w:val="0"/>
-          <w:numId w:val="12"/>
-        </w:numPr>
-        <w:rPr>
-          <w:rFonts w:ascii="Times New Roman" w:hAnsi="Times New Roman" w:cs="Times New Roman"/>
-        </w:rPr>
-      </w:pPr>
-      <w:r>
-        <w:rPr>
-          <w:rFonts w:ascii="Times New Roman" w:hAnsi="Times New Roman" w:cs="Times New Roman"/>
-        </w:rPr>
-        <w:lastRenderedPageBreak/>
-        <w:t>Explotación de know-how.</w:t>
-      </w:r>
-    </w:p>
-    <w:p>
-      <w:pPr>
-        <w:numPr>
-          <w:ilvl w:val="0"/>
-          <w:numId w:val="12"/>
-        </w:numPr>
-        <w:rPr>
-          <w:rFonts w:ascii="Times New Roman" w:hAnsi="Times New Roman" w:cs="Times New Roman"/>
-        </w:rPr>
-      </w:pPr>
-      <w:r>
-        <w:rPr>
-          <w:rFonts w:ascii="Times New Roman" w:hAnsi="Times New Roman" w:cs="Times New Roman"/>
-        </w:rPr>
-        <w:t>Prestación de servicios especializados.</w:t>
-      </w:r>
-    </w:p>
-    <w:p>
-      <w:pPr>
-        <w:numPr>
-          <w:ilvl w:val="0"/>
-          <w:numId w:val="12"/>
-        </w:numPr>
-        <w:rPr>
-          <w:rFonts w:ascii="Times New Roman" w:hAnsi="Times New Roman" w:cs="Times New Roman"/>
-        </w:rPr>
-      </w:pPr>
-      <w:r>
-        <w:rPr>
-          <w:rFonts w:ascii="Times New Roman" w:hAnsi="Times New Roman" w:cs="Times New Roman"/>
-        </w:rPr>
-        <w:t>Posible constitución de Empresa de Base Tecnológica.</w:t>
-      </w:r>
-    </w:p>
-    <w:p>
-      <w:pPr>
-        <w:rPr>
-          <w:rFonts w:ascii="Times New Roman" w:hAnsi="Times New Roman" w:cs="Times New Roman"/>
           <w:b/>
           <w:bCs/>
         </w:rPr>
       </w:pPr>
       <w:r>
         <w:rPr>
-          <w:rFonts w:ascii="Times New Roman" w:hAnsi="Times New Roman" w:cs="Times New Roman"/>
           <w:b/>
           <w:bCs/>
         </w:rPr>
@@ -2073,7 +1181,6 @@
       </w:r>
       <w:r>
         <w:rPr>
-          <w:rFonts w:ascii="Times New Roman" w:hAnsi="Times New Roman" w:cs="Times New Roman"/>
           <w:b/>
           <w:bCs/>
         </w:rPr>
@@ -2082,191 +1189,103 @@
       </w:r>
     </w:p>
     <w:p>
+      <w:r>
+        <w:t>Construir una referencia europea en:</w:t>
+      </w:r>
+    </w:p>
+    <w:p>
+      <w:pPr>
+        <w:numPr>
+          <w:ilvl w:val="0"/>
+          <w:numId w:val="13"/>
+        </w:numPr>
+      </w:pPr>
+      <w:r>
+        <w:t>Auditoría de IA.</w:t>
+      </w:r>
+    </w:p>
+    <w:p>
+      <w:pPr>
+        <w:numPr>
+          <w:ilvl w:val="0"/>
+          <w:numId w:val="13"/>
+        </w:numPr>
+      </w:pPr>
+      <w:r>
+        <w:t>Gobernanza algorítmica.</w:t>
+      </w:r>
+    </w:p>
+    <w:p>
+      <w:pPr>
+        <w:numPr>
+          <w:ilvl w:val="0"/>
+          <w:numId w:val="13"/>
+        </w:numPr>
+      </w:pPr>
+      <w:r>
+        <w:t>Medición de convergencia semántica.</w:t>
+      </w:r>
+    </w:p>
+    <w:p>
+      <w:pPr>
+        <w:numPr>
+          <w:ilvl w:val="0"/>
+          <w:numId w:val="13"/>
+        </w:numPr>
+      </w:pPr>
+      <w:r>
+        <w:t>Detección de colapso de distinción.</w:t>
+      </w:r>
+    </w:p>
+    <w:p>
+      <w:pPr>
+        <w:numPr>
+          <w:ilvl w:val="0"/>
+          <w:numId w:val="13"/>
+        </w:numPr>
+      </w:pPr>
+      <w:r>
+        <w:t>Evaluación avanzada de riesgos emergentes en inteligencia artificial.</w:t>
+      </w:r>
+    </w:p>
+    <w:p>
+      <w:r>
+        <w:t>Marca corporativa:</w:t>
+      </w:r>
+    </w:p>
+    <w:p>
+      <w:r>
+        <w:t>CONTINUUM AI ANALYTICS</w:t>
+      </w:r>
+    </w:p>
+    <w:p>
+      <w:r>
+        <w:t>Unidad tecnológica:</w:t>
+      </w:r>
+    </w:p>
+    <w:p>
+      <w:r>
+        <w:t>CSI LABS</w:t>
+      </w:r>
+    </w:p>
+    <w:p>
+      <w:r>
+        <w:t>Activo principal:</w:t>
+      </w:r>
+    </w:p>
+    <w:p>
+      <w:r>
+        <w:t>CONTINUUM SEMANTIC INDEX (CSI)</w:t>
+      </w:r>
+    </w:p>
+    <w:p>
       <w:pPr>
         <w:rPr>
-          <w:rFonts w:ascii="Times New Roman" w:hAnsi="Times New Roman" w:cs="Times New Roman"/>
-        </w:rPr>
-      </w:pPr>
-      <w:r>
-        <w:rPr>
-          <w:rFonts w:ascii="Times New Roman" w:hAnsi="Times New Roman" w:cs="Times New Roman"/>
-        </w:rPr>
-        <w:t>Construir una referencia europea en:</w:t>
-      </w:r>
-    </w:p>
-    <w:p>
-      <w:pPr>
-        <w:numPr>
-          <w:ilvl w:val="0"/>
-          <w:numId w:val="13"/>
-        </w:numPr>
-        <w:rPr>
-          <w:rFonts w:ascii="Times New Roman" w:hAnsi="Times New Roman" w:cs="Times New Roman"/>
-        </w:rPr>
-      </w:pPr>
-      <w:r>
-        <w:rPr>
-          <w:rFonts w:ascii="Times New Roman" w:hAnsi="Times New Roman" w:cs="Times New Roman"/>
-        </w:rPr>
-        <w:t>Auditoría de IA.</w:t>
-      </w:r>
-    </w:p>
-    <w:p>
-      <w:pPr>
-        <w:numPr>
-          <w:ilvl w:val="0"/>
-          <w:numId w:val="13"/>
-        </w:numPr>
-        <w:rPr>
-          <w:rFonts w:ascii="Times New Roman" w:hAnsi="Times New Roman" w:cs="Times New Roman"/>
-        </w:rPr>
-      </w:pPr>
-      <w:r>
-        <w:rPr>
-          <w:rFonts w:ascii="Times New Roman" w:hAnsi="Times New Roman" w:cs="Times New Roman"/>
-        </w:rPr>
-        <w:t>Gobernanza algorítmica.</w:t>
-      </w:r>
-    </w:p>
-    <w:p>
-      <w:pPr>
-        <w:numPr>
-          <w:ilvl w:val="0"/>
-          <w:numId w:val="13"/>
-        </w:numPr>
-        <w:rPr>
-          <w:rFonts w:ascii="Times New Roman" w:hAnsi="Times New Roman" w:cs="Times New Roman"/>
-        </w:rPr>
-      </w:pPr>
-      <w:r>
-        <w:rPr>
-          <w:rFonts w:ascii="Times New Roman" w:hAnsi="Times New Roman" w:cs="Times New Roman"/>
-        </w:rPr>
-        <w:t>Medición de convergencia semántica.</w:t>
-      </w:r>
-    </w:p>
-    <w:p>
-      <w:pPr>
-        <w:numPr>
-          <w:ilvl w:val="0"/>
-          <w:numId w:val="13"/>
-        </w:numPr>
-        <w:rPr>
-          <w:rFonts w:ascii="Times New Roman" w:hAnsi="Times New Roman" w:cs="Times New Roman"/>
-        </w:rPr>
-      </w:pPr>
-      <w:r>
-        <w:rPr>
-          <w:rFonts w:ascii="Times New Roman" w:hAnsi="Times New Roman" w:cs="Times New Roman"/>
-        </w:rPr>
-        <w:t>Detección de colapso de distinción.</w:t>
-      </w:r>
-    </w:p>
-    <w:p>
-      <w:pPr>
-        <w:numPr>
-          <w:ilvl w:val="0"/>
-          <w:numId w:val="13"/>
-        </w:numPr>
-        <w:rPr>
-          <w:rFonts w:ascii="Times New Roman" w:hAnsi="Times New Roman" w:cs="Times New Roman"/>
-        </w:rPr>
-      </w:pPr>
-      <w:r>
-        <w:rPr>
-          <w:rFonts w:ascii="Times New Roman" w:hAnsi="Times New Roman" w:cs="Times New Roman"/>
-        </w:rPr>
-        <w:t>Evaluación avanzada de riesgos emergentes en inteligencia artificial.</w:t>
-      </w:r>
-    </w:p>
-    <w:p>
-      <w:pPr>
-        <w:rPr>
-          <w:rFonts w:ascii="Times New Roman" w:hAnsi="Times New Roman" w:cs="Times New Roman"/>
-        </w:rPr>
-      </w:pPr>
-      <w:r>
-        <w:rPr>
-          <w:rFonts w:ascii="Times New Roman" w:hAnsi="Times New Roman" w:cs="Times New Roman"/>
-        </w:rPr>
-        <w:t>Marca corporativa:</w:t>
-      </w:r>
-    </w:p>
-    <w:p>
-      <w:pPr>
-        <w:rPr>
-          <w:rFonts w:ascii="Times New Roman" w:hAnsi="Times New Roman" w:cs="Times New Roman"/>
-        </w:rPr>
-      </w:pPr>
-      <w:r>
-        <w:rPr>
-          <w:rFonts w:ascii="Times New Roman" w:hAnsi="Times New Roman" w:cs="Times New Roman"/>
-        </w:rPr>
-        <w:t>CONTINUUM AI ANALYTICS</w:t>
-      </w:r>
-    </w:p>
-    <w:p>
-      <w:pPr>
-        <w:rPr>
-          <w:rFonts w:ascii="Times New Roman" w:hAnsi="Times New Roman" w:cs="Times New Roman"/>
-        </w:rPr>
-      </w:pPr>
-      <w:r>
-        <w:rPr>
-          <w:rFonts w:ascii="Times New Roman" w:hAnsi="Times New Roman" w:cs="Times New Roman"/>
-        </w:rPr>
-        <w:t>Unidad tecnológica:</w:t>
-      </w:r>
-    </w:p>
-    <w:p>
-      <w:pPr>
-        <w:rPr>
-          <w:rFonts w:ascii="Times New Roman" w:hAnsi="Times New Roman" w:cs="Times New Roman"/>
-        </w:rPr>
-      </w:pPr>
-      <w:r>
-        <w:rPr>
-          <w:rFonts w:ascii="Times New Roman" w:hAnsi="Times New Roman" w:cs="Times New Roman"/>
-        </w:rPr>
-        <w:t>CSI LABS</w:t>
-      </w:r>
-    </w:p>
-    <w:p>
-      <w:pPr>
-        <w:rPr>
-          <w:rFonts w:ascii="Times New Roman" w:hAnsi="Times New Roman" w:cs="Times New Roman"/>
-        </w:rPr>
-      </w:pPr>
-      <w:r>
-        <w:rPr>
-          <w:rFonts w:ascii="Times New Roman" w:hAnsi="Times New Roman" w:cs="Times New Roman"/>
-        </w:rPr>
-        <w:t>Activo principal:</w:t>
-      </w:r>
-    </w:p>
-    <w:p>
-      <w:pPr>
-        <w:rPr>
-          <w:rFonts w:ascii="Times New Roman" w:hAnsi="Times New Roman" w:cs="Times New Roman"/>
-        </w:rPr>
-      </w:pPr>
-      <w:r>
-        <w:rPr>
-          <w:rFonts w:ascii="Times New Roman" w:hAnsi="Times New Roman" w:cs="Times New Roman"/>
-        </w:rPr>
-        <w:t>CONTINUUM SEMANTIC INDEX (CSI)</w:t>
-      </w:r>
-    </w:p>
-    <w:p>
-      <w:pPr>
-        <w:rPr>
-          <w:rFonts w:ascii="Times New Roman" w:hAnsi="Times New Roman" w:cs="Times New Roman"/>
           <w:lang w:val="en-IE"/>
         </w:rPr>
       </w:pPr>
       <w:r>
         <w:rPr>
-          <w:rFonts w:ascii="Times New Roman" w:hAnsi="Times New Roman" w:cs="Times New Roman"/>
           <w:lang w:val="en-IE"/>
         </w:rPr>
         <w:t>Lema provisional:</w:t>
@@ -2275,13 +1294,11 @@
     <w:p>
       <w:pPr>
         <w:rPr>
-          <w:rFonts w:ascii="Times New Roman" w:hAnsi="Times New Roman" w:cs="Times New Roman"/>
           <w:lang w:val="en-IE"/>
         </w:rPr>
       </w:pPr>
       <w:r>
         <w:rPr>
-          <w:rFonts w:ascii="Times New Roman" w:hAnsi="Times New Roman" w:cs="Times New Roman"/>
           <w:lang w:val="en-IE"/>
         </w:rPr>
         <w:t>"Measuring Semantic Convergence Before It Becomes Risk."</w:t>
@@ -4845,7 +3862,6 @@
   <w:style w:type="character" w:default="1" w:styleId="Fuentedeprrafopredeter">
     <w:name w:val="Default Paragraph Font"/>
     <w:uiPriority w:val="1"/>
-    <w:semiHidden/>
     <w:unhideWhenUsed/>
   </w:style>
   <w:style w:type="table" w:default="1" w:styleId="Tablanormal">

</xml_diff>